<commit_message>
wrote the a few more annotations/comments I had
</commit_message>
<xml_diff>
--- a/Iteration_2/Echo_Networking/Networking_Outline.docx
+++ b/Iteration_2/Echo_Networking/Networking_Outline.docx
@@ -33,7 +33,6 @@
           <w:vertAlign w:val="baseline"/>
         </w:rPr>
       </w:pPr>
-      <w:commentRangeStart w:id="0"/>
       <w:r>
         <w:rPr>
           <w:rFonts w:ascii="Arial" w:cs="Arial" w:eastAsia="Arial" w:hAnsi="Arial"/>
@@ -50,10 +49,6 @@
           <w:rtl w:val="0"/>
         </w:rPr>
         <w:t xml:space="preserve">There</w:t>
-      </w:r>
-      <w:commentRangeEnd w:id="0"/>
-      <w:r>
-        <w:commentReference w:id="0"/>
       </w:r>
       <w:r>
         <w:rPr>
@@ -482,7 +477,7 @@
         </w:rPr>
         <w:t xml:space="preserve">clients </w:t>
       </w:r>
-      <w:commentRangeStart w:id="1"/>
+      <w:commentRangeStart w:id="0"/>
       <w:r>
         <w:rPr>
           <w:rtl w:val="0"/>
@@ -520,9 +515,9 @@
           <w:vertAlign w:val="baseline"/>
         </w:rPr>
       </w:pPr>
-      <w:commentRangeEnd w:id="1"/>
-      <w:r>
-        <w:commentReference w:id="1"/>
+      <w:commentRangeEnd w:id="0"/>
+      <w:r>
+        <w:commentReference w:id="0"/>
       </w:r>
       <w:r>
         <w:rPr>
@@ -539,7 +534,43 @@
           <w:vertAlign w:val="baseline"/>
           <w:rtl w:val="0"/>
         </w:rPr>
-        <w:t xml:space="preserve">Connecting to the server to Login/create a new profile &amp; Sending the  Leaderboard information from the server to client </w:t>
+        <w:t xml:space="preserve">Connecting to the server to Login/create a new profile &amp; Sending the</w:t>
+      </w:r>
+      <w:del w:author="Hannah Xia" w:id="1" w:date="2024-11-13T20:24:08Z">
+        <w:r>
+          <w:rPr>
+            <w:rFonts w:ascii="Arial" w:cs="Arial" w:eastAsia="Arial" w:hAnsi="Arial"/>
+            <w:b w:val="1"/>
+            <w:i w:val="0"/>
+            <w:smallCaps w:val="0"/>
+            <w:strike w:val="0"/>
+            <w:color w:val="000000"/>
+            <w:sz w:val="24"/>
+            <w:szCs w:val="24"/>
+            <w:u w:val="none"/>
+            <w:shd w:fill="auto" w:val="clear"/>
+            <w:vertAlign w:val="baseline"/>
+            <w:rtl w:val="0"/>
+          </w:rPr>
+          <w:delText xml:space="preserve"> </w:delText>
+        </w:r>
+      </w:del>
+      <w:r>
+        <w:rPr>
+          <w:rFonts w:ascii="Arial" w:cs="Arial" w:eastAsia="Arial" w:hAnsi="Arial"/>
+          <w:b w:val="1"/>
+          <w:i w:val="0"/>
+          <w:smallCaps w:val="0"/>
+          <w:strike w:val="0"/>
+          <w:color w:val="000000"/>
+          <w:sz w:val="24"/>
+          <w:szCs w:val="24"/>
+          <w:u w:val="none"/>
+          <w:shd w:fill="auto" w:val="clear"/>
+          <w:vertAlign w:val="baseline"/>
+          <w:rtl w:val="0"/>
+        </w:rPr>
+        <w:t xml:space="preserve"> Leaderboard information from the server to client </w:t>
       </w:r>
     </w:p>
     <w:p>
@@ -588,7 +619,86 @@
           <w:vertAlign w:val="baseline"/>
           <w:rtl w:val="0"/>
         </w:rPr>
-        <w:t xml:space="preserve">The first two are mostly covered by the Authentication &amp; Profile Team as well as the  Leaderboard &amp; Matchmaking Team, so we simply will need to utilize the functions they end  up making and sending the data they prepare over our connection </w:t>
+        <w:t xml:space="preserve">The first two are mostly covered by the Authentication &amp; Profile Team as well as the  Leaderboard &amp; Matchmaking Team, so we simply will need to utilize the functions they end</w:t>
+      </w:r>
+      <w:del w:author="Hannah Xia" w:id="2" w:date="2024-11-13T19:56:49Z">
+        <w:r>
+          <w:rPr>
+            <w:rFonts w:ascii="Arial" w:cs="Arial" w:eastAsia="Arial" w:hAnsi="Arial"/>
+            <w:b w:val="0"/>
+            <w:i w:val="0"/>
+            <w:smallCaps w:val="0"/>
+            <w:strike w:val="0"/>
+            <w:color w:val="000000"/>
+            <w:sz w:val="24"/>
+            <w:szCs w:val="24"/>
+            <w:u w:val="none"/>
+            <w:shd w:fill="auto" w:val="clear"/>
+            <w:vertAlign w:val="baseline"/>
+            <w:rtl w:val="0"/>
+          </w:rPr>
+          <w:delText xml:space="preserve"> </w:delText>
+        </w:r>
+      </w:del>
+      <w:r>
+        <w:rPr>
+          <w:rFonts w:ascii="Arial" w:cs="Arial" w:eastAsia="Arial" w:hAnsi="Arial"/>
+          <w:b w:val="0"/>
+          <w:i w:val="0"/>
+          <w:smallCaps w:val="0"/>
+          <w:strike w:val="0"/>
+          <w:color w:val="000000"/>
+          <w:sz w:val="24"/>
+          <w:szCs w:val="24"/>
+          <w:u w:val="none"/>
+          <w:shd w:fill="auto" w:val="clear"/>
+          <w:vertAlign w:val="baseline"/>
+          <w:rtl w:val="0"/>
+        </w:rPr>
+        <w:t xml:space="preserve"> up making and sending the data they prepare over our connection</w:t>
+      </w:r>
+      <w:ins w:author="Hannah Xia" w:id="3" w:date="2024-11-13T20:24:12Z">
+        <w:r>
+          <w:rPr>
+            <w:rFonts w:ascii="Arial" w:cs="Arial" w:eastAsia="Arial" w:hAnsi="Arial"/>
+            <w:b w:val="0"/>
+            <w:i w:val="0"/>
+            <w:smallCaps w:val="0"/>
+            <w:strike w:val="0"/>
+            <w:color w:val="000000"/>
+            <w:sz w:val="24"/>
+            <w:szCs w:val="24"/>
+            <w:u w:val="none"/>
+            <w:shd w:fill="auto" w:val="clear"/>
+            <w:vertAlign w:val="baseline"/>
+            <w:rtl w:val="0"/>
+          </w:rPr>
+          <w:t xml:space="preserve">.</w:t>
+        </w:r>
+      </w:ins>
+      <w:del w:author="Hannah Xia" w:id="3" w:date="2024-11-13T20:24:12Z">
+        <w:r>
+          <w:rPr>
+            <w:rFonts w:ascii="Arial" w:cs="Arial" w:eastAsia="Arial" w:hAnsi="Arial"/>
+            <w:b w:val="0"/>
+            <w:i w:val="0"/>
+            <w:smallCaps w:val="0"/>
+            <w:strike w:val="0"/>
+            <w:color w:val="000000"/>
+            <w:sz w:val="24"/>
+            <w:szCs w:val="24"/>
+            <w:u w:val="none"/>
+            <w:shd w:fill="auto" w:val="clear"/>
+            <w:vertAlign w:val="baseline"/>
+            <w:rtl w:val="0"/>
+          </w:rPr>
+          <w:delText xml:space="preserve"> </w:delText>
+        </w:r>
+      </w:del>
+      <w:r>
+        <w:rPr>
+          <w:rtl w:val="0"/>
+        </w:rPr>
       </w:r>
     </w:p>
     <w:p>
@@ -637,9 +747,81 @@
           <w:vertAlign w:val="baseline"/>
           <w:rtl w:val="0"/>
         </w:rPr>
-        <w:t xml:space="preserve">For our part of authentication: we should have a function that is called by the auth team,  that takes in the username and password and preps them for being sent to the server,  where the server compares them against its own file, and then another function to tell the  auth teams code if the checks passed or fail, this function would be called by our</w:t>
-      </w:r>
-      <w:del w:author="Hannah Xia" w:id="1" w:date="2024-11-11T03:53:22Z">
+        <w:t xml:space="preserve">For our part of authentication: we should have a function that is called by the auth team,</w:t>
+      </w:r>
+      <w:del w:author="Hannah Xia" w:id="4" w:date="2024-11-13T20:24:23Z">
+        <w:r>
+          <w:rPr>
+            <w:rFonts w:ascii="Arial" w:cs="Arial" w:eastAsia="Arial" w:hAnsi="Arial"/>
+            <w:b w:val="0"/>
+            <w:i w:val="0"/>
+            <w:smallCaps w:val="0"/>
+            <w:strike w:val="0"/>
+            <w:color w:val="000000"/>
+            <w:sz w:val="24"/>
+            <w:szCs w:val="24"/>
+            <w:u w:val="none"/>
+            <w:shd w:fill="auto" w:val="clear"/>
+            <w:vertAlign w:val="baseline"/>
+            <w:rtl w:val="0"/>
+          </w:rPr>
+          <w:delText xml:space="preserve"> </w:delText>
+        </w:r>
+      </w:del>
+      <w:r>
+        <w:rPr>
+          <w:rFonts w:ascii="Arial" w:cs="Arial" w:eastAsia="Arial" w:hAnsi="Arial"/>
+          <w:b w:val="0"/>
+          <w:i w:val="0"/>
+          <w:smallCaps w:val="0"/>
+          <w:strike w:val="0"/>
+          <w:color w:val="000000"/>
+          <w:sz w:val="24"/>
+          <w:szCs w:val="24"/>
+          <w:u w:val="none"/>
+          <w:shd w:fill="auto" w:val="clear"/>
+          <w:vertAlign w:val="baseline"/>
+          <w:rtl w:val="0"/>
+        </w:rPr>
+        <w:t xml:space="preserve"> that takes in the username and password and preps them for being sent to the server,</w:t>
+      </w:r>
+      <w:del w:author="Hannah Xia" w:id="5" w:date="2024-11-13T20:24:25Z">
+        <w:r>
+          <w:rPr>
+            <w:rFonts w:ascii="Arial" w:cs="Arial" w:eastAsia="Arial" w:hAnsi="Arial"/>
+            <w:b w:val="0"/>
+            <w:i w:val="0"/>
+            <w:smallCaps w:val="0"/>
+            <w:strike w:val="0"/>
+            <w:color w:val="000000"/>
+            <w:sz w:val="24"/>
+            <w:szCs w:val="24"/>
+            <w:u w:val="none"/>
+            <w:shd w:fill="auto" w:val="clear"/>
+            <w:vertAlign w:val="baseline"/>
+            <w:rtl w:val="0"/>
+          </w:rPr>
+          <w:delText xml:space="preserve"> </w:delText>
+        </w:r>
+      </w:del>
+      <w:r>
+        <w:rPr>
+          <w:rFonts w:ascii="Arial" w:cs="Arial" w:eastAsia="Arial" w:hAnsi="Arial"/>
+          <w:b w:val="0"/>
+          <w:i w:val="0"/>
+          <w:smallCaps w:val="0"/>
+          <w:strike w:val="0"/>
+          <w:color w:val="000000"/>
+          <w:sz w:val="24"/>
+          <w:szCs w:val="24"/>
+          <w:u w:val="none"/>
+          <w:shd w:fill="auto" w:val="clear"/>
+          <w:vertAlign w:val="baseline"/>
+          <w:rtl w:val="0"/>
+        </w:rPr>
+        <w:t xml:space="preserve"> where the server compares them against its own file, and then another function to tell the  auth teams code if the checks passed or fail, this function would be called by our</w:t>
+      </w:r>
+      <w:del w:author="Hannah Xia" w:id="6" w:date="2024-11-11T03:53:22Z">
         <w:r>
           <w:rPr>
             <w:rFonts w:ascii="Arial" w:cs="Arial" w:eastAsia="Arial" w:hAnsi="Arial"/>
@@ -673,7 +855,50 @@
           <w:vertAlign w:val="baseline"/>
           <w:rtl w:val="0"/>
         </w:rPr>
-        <w:t xml:space="preserve"> clients-side loop after it collects the servers response  </w:t>
+        <w:t xml:space="preserve"> clients-side loop after it collects the servers response</w:t>
+      </w:r>
+      <w:ins w:author="Hannah Xia" w:id="7" w:date="2024-11-13T20:24:26Z">
+        <w:r>
+          <w:rPr>
+            <w:rFonts w:ascii="Arial" w:cs="Arial" w:eastAsia="Arial" w:hAnsi="Arial"/>
+            <w:b w:val="0"/>
+            <w:i w:val="0"/>
+            <w:smallCaps w:val="0"/>
+            <w:strike w:val="0"/>
+            <w:color w:val="000000"/>
+            <w:sz w:val="24"/>
+            <w:szCs w:val="24"/>
+            <w:u w:val="none"/>
+            <w:shd w:fill="auto" w:val="clear"/>
+            <w:vertAlign w:val="baseline"/>
+            <w:rtl w:val="0"/>
+          </w:rPr>
+          <w:t xml:space="preserve">.</w:t>
+        </w:r>
+      </w:ins>
+      <w:del w:author="Hannah Xia" w:id="7" w:date="2024-11-13T20:24:26Z">
+        <w:r>
+          <w:rPr>
+            <w:rFonts w:ascii="Arial" w:cs="Arial" w:eastAsia="Arial" w:hAnsi="Arial"/>
+            <w:b w:val="0"/>
+            <w:i w:val="0"/>
+            <w:smallCaps w:val="0"/>
+            <w:strike w:val="0"/>
+            <w:color w:val="000000"/>
+            <w:sz w:val="24"/>
+            <w:szCs w:val="24"/>
+            <w:u w:val="none"/>
+            <w:shd w:fill="auto" w:val="clear"/>
+            <w:vertAlign w:val="baseline"/>
+            <w:rtl w:val="0"/>
+          </w:rPr>
+          <w:delText xml:space="preserve">  </w:delText>
+        </w:r>
+      </w:del>
+      <w:r>
+        <w:rPr>
+          <w:rtl w:val="0"/>
+        </w:rPr>
       </w:r>
     </w:p>
     <w:p>
@@ -722,7 +947,43 @@
           <w:vertAlign w:val="baseline"/>
           <w:rtl w:val="0"/>
         </w:rPr>
-        <w:t xml:space="preserve">Then there should also be a function for creating a new user, as well as another function to grab the data the server returns and let the auth team’s code know it if succeeded and to proceed or if that user already exists or something like that </w:t>
+        <w:t xml:space="preserve">Then there should also be a function for creating a new user, as well as another function to grab the data the server returns and let the auth team’s code know it if succeeded and to proceed or if that user already exists or something like that</w:t>
+      </w:r>
+      <w:ins w:author="Hannah Xia" w:id="8" w:date="2024-11-13T20:24:34Z">
+        <w:r>
+          <w:rPr>
+            <w:rFonts w:ascii="Arial" w:cs="Arial" w:eastAsia="Arial" w:hAnsi="Arial"/>
+            <w:b w:val="0"/>
+            <w:i w:val="0"/>
+            <w:smallCaps w:val="0"/>
+            <w:strike w:val="0"/>
+            <w:color w:val="000000"/>
+            <w:sz w:val="24"/>
+            <w:szCs w:val="24"/>
+            <w:u w:val="none"/>
+            <w:shd w:fill="auto" w:val="clear"/>
+            <w:vertAlign w:val="baseline"/>
+            <w:rtl w:val="0"/>
+          </w:rPr>
+          <w:t xml:space="preserve">.</w:t>
+        </w:r>
+      </w:ins>
+      <w:r>
+        <w:rPr>
+          <w:rFonts w:ascii="Arial" w:cs="Arial" w:eastAsia="Arial" w:hAnsi="Arial"/>
+          <w:b w:val="0"/>
+          <w:i w:val="0"/>
+          <w:smallCaps w:val="0"/>
+          <w:strike w:val="0"/>
+          <w:color w:val="000000"/>
+          <w:sz w:val="24"/>
+          <w:szCs w:val="24"/>
+          <w:u w:val="none"/>
+          <w:shd w:fill="auto" w:val="clear"/>
+          <w:vertAlign w:val="baseline"/>
+          <w:rtl w:val="0"/>
+        </w:rPr>
+        <w:t xml:space="preserve"> </w:t>
       </w:r>
     </w:p>
     <w:p>
@@ -771,7 +1032,43 @@
           <w:vertAlign w:val="baseline"/>
           <w:rtl w:val="0"/>
         </w:rPr>
-        <w:t xml:space="preserve">The auth team should be responsible for the code that compares username and password, we just need our server code to call it and return the results </w:t>
+        <w:t xml:space="preserve">The auth team should be responsible for the code that compares username and password, we just need our server code to call it and return the results</w:t>
+      </w:r>
+      <w:ins w:author="Hannah Xia" w:id="9" w:date="2024-11-13T20:24:38Z">
+        <w:r>
+          <w:rPr>
+            <w:rFonts w:ascii="Arial" w:cs="Arial" w:eastAsia="Arial" w:hAnsi="Arial"/>
+            <w:b w:val="0"/>
+            <w:i w:val="0"/>
+            <w:smallCaps w:val="0"/>
+            <w:strike w:val="0"/>
+            <w:color w:val="000000"/>
+            <w:sz w:val="24"/>
+            <w:szCs w:val="24"/>
+            <w:u w:val="none"/>
+            <w:shd w:fill="auto" w:val="clear"/>
+            <w:vertAlign w:val="baseline"/>
+            <w:rtl w:val="0"/>
+          </w:rPr>
+          <w:t xml:space="preserve">.</w:t>
+        </w:r>
+      </w:ins>
+      <w:r>
+        <w:rPr>
+          <w:rFonts w:ascii="Arial" w:cs="Arial" w:eastAsia="Arial" w:hAnsi="Arial"/>
+          <w:b w:val="0"/>
+          <w:i w:val="0"/>
+          <w:smallCaps w:val="0"/>
+          <w:strike w:val="0"/>
+          <w:color w:val="000000"/>
+          <w:sz w:val="24"/>
+          <w:szCs w:val="24"/>
+          <w:u w:val="none"/>
+          <w:shd w:fill="auto" w:val="clear"/>
+          <w:vertAlign w:val="baseline"/>
+          <w:rtl w:val="0"/>
+        </w:rPr>
+        <w:t xml:space="preserve"> </w:t>
       </w:r>
     </w:p>
     <w:p>
@@ -805,7 +1102,7 @@
           <w:vertAlign w:val="baseline"/>
         </w:rPr>
       </w:pPr>
-      <w:commentRangeStart w:id="2"/>
+      <w:commentRangeStart w:id="1"/>
       <w:r>
         <w:rPr>
           <w:rFonts w:ascii="Arial" w:cs="Arial" w:eastAsia="Arial" w:hAnsi="Arial"/>
@@ -848,9 +1145,9 @@
         </w:rPr>
         <w:t xml:space="preserve">the leaderboard code</w:t>
       </w:r>
-      <w:commentRangeEnd w:id="2"/>
-      <w:r>
-        <w:commentReference w:id="2"/>
+      <w:commentRangeEnd w:id="1"/>
+      <w:r>
+        <w:commentReference w:id="1"/>
       </w:r>
       <w:r>
         <w:rPr>
@@ -889,22 +1186,60 @@
           <w:vertAlign w:val="baseline"/>
         </w:rPr>
       </w:pPr>
-      <w:r>
-        <w:rPr>
-          <w:rFonts w:ascii="Arial" w:cs="Arial" w:eastAsia="Arial" w:hAnsi="Arial"/>
-          <w:b w:val="0"/>
-          <w:i w:val="0"/>
-          <w:smallCaps w:val="0"/>
-          <w:strike w:val="0"/>
-          <w:color w:val="000000"/>
-          <w:sz w:val="24"/>
-          <w:szCs w:val="24"/>
-          <w:u w:val="none"/>
-          <w:shd w:fill="auto" w:val="clear"/>
-          <w:vertAlign w:val="baseline"/>
-          <w:rtl w:val="0"/>
-        </w:rPr>
-        <w:t xml:space="preserve">Ill try to talk to the leaderboard team to see what kind of data structures they will be using  to store this information, until then we can leave this on the backburner  </w:t>
+      <w:ins w:author="Hannah Xia" w:id="10" w:date="2024-11-13T20:24:47Z">
+        <w:r>
+          <w:rPr>
+            <w:rFonts w:ascii="Arial" w:cs="Arial" w:eastAsia="Arial" w:hAnsi="Arial"/>
+            <w:b w:val="0"/>
+            <w:i w:val="0"/>
+            <w:smallCaps w:val="0"/>
+            <w:strike w:val="0"/>
+            <w:color w:val="000000"/>
+            <w:sz w:val="24"/>
+            <w:szCs w:val="24"/>
+            <w:u w:val="none"/>
+            <w:shd w:fill="auto" w:val="clear"/>
+            <w:vertAlign w:val="baseline"/>
+            <w:rtl w:val="0"/>
+          </w:rPr>
+          <w:t xml:space="preserve">I'll</w:t>
+        </w:r>
+      </w:ins>
+      <w:del w:author="Hannah Xia" w:id="10" w:date="2024-11-13T20:24:47Z">
+        <w:r>
+          <w:rPr>
+            <w:rFonts w:ascii="Arial" w:cs="Arial" w:eastAsia="Arial" w:hAnsi="Arial"/>
+            <w:b w:val="0"/>
+            <w:i w:val="0"/>
+            <w:smallCaps w:val="0"/>
+            <w:strike w:val="0"/>
+            <w:color w:val="000000"/>
+            <w:sz w:val="24"/>
+            <w:szCs w:val="24"/>
+            <w:u w:val="none"/>
+            <w:shd w:fill="auto" w:val="clear"/>
+            <w:vertAlign w:val="baseline"/>
+            <w:rtl w:val="0"/>
+          </w:rPr>
+          <w:delText xml:space="preserve">Ill</w:delText>
+        </w:r>
+      </w:del>
+      <w:r>
+        <w:rPr>
+          <w:rFonts w:ascii="Arial" w:cs="Arial" w:eastAsia="Arial" w:hAnsi="Arial"/>
+          <w:b w:val="0"/>
+          <w:i w:val="0"/>
+          <w:smallCaps w:val="0"/>
+          <w:strike w:val="0"/>
+          <w:color w:val="000000"/>
+          <w:sz w:val="24"/>
+          <w:szCs w:val="24"/>
+          <w:u w:val="none"/>
+          <w:shd w:fill="auto" w:val="clear"/>
+          <w:vertAlign w:val="baseline"/>
+          <w:rtl w:val="0"/>
+        </w:rPr>
+        <w:t xml:space="preserve"> try to talk to the leaderboard team to see what kind of data structures they will be using  to store this information, until then we can leave this on the backburner  </w:t>
       </w:r>
     </w:p>
     <w:p>
@@ -1002,7 +1337,62 @@
           <w:vertAlign w:val="baseline"/>
           <w:rtl w:val="0"/>
         </w:rPr>
-        <w:t xml:space="preserve">Chatting between clients during match's </w:t>
+        <w:t xml:space="preserve">Chatting between clients during </w:t>
+      </w:r>
+      <w:ins w:author="Hannah Xia" w:id="11" w:date="2024-11-13T20:24:52Z">
+        <w:r>
+          <w:rPr>
+            <w:rFonts w:ascii="Arial" w:cs="Arial" w:eastAsia="Arial" w:hAnsi="Arial"/>
+            <w:b w:val="1"/>
+            <w:i w:val="0"/>
+            <w:smallCaps w:val="0"/>
+            <w:strike w:val="0"/>
+            <w:color w:val="000000"/>
+            <w:sz w:val="24"/>
+            <w:szCs w:val="24"/>
+            <w:u w:val="none"/>
+            <w:shd w:fill="auto" w:val="clear"/>
+            <w:vertAlign w:val="baseline"/>
+            <w:rtl w:val="0"/>
+          </w:rPr>
+          <w:t xml:space="preserve">matches</w:t>
+        </w:r>
+      </w:ins>
+      <w:del w:author="Hannah Xia" w:id="11" w:date="2024-11-13T20:24:52Z">
+        <w:r>
+          <w:rPr>
+            <w:rFonts w:ascii="Arial" w:cs="Arial" w:eastAsia="Arial" w:hAnsi="Arial"/>
+            <w:b w:val="1"/>
+            <w:i w:val="0"/>
+            <w:smallCaps w:val="0"/>
+            <w:strike w:val="0"/>
+            <w:color w:val="000000"/>
+            <w:sz w:val="24"/>
+            <w:szCs w:val="24"/>
+            <w:u w:val="none"/>
+            <w:shd w:fill="auto" w:val="clear"/>
+            <w:vertAlign w:val="baseline"/>
+            <w:rtl w:val="0"/>
+          </w:rPr>
+          <w:delText xml:space="preserve">match's</w:delText>
+        </w:r>
+      </w:del>
+      <w:r>
+        <w:rPr>
+          <w:rFonts w:ascii="Arial" w:cs="Arial" w:eastAsia="Arial" w:hAnsi="Arial"/>
+          <w:b w:val="1"/>
+          <w:i w:val="0"/>
+          <w:smallCaps w:val="0"/>
+          <w:strike w:val="0"/>
+          <w:color w:val="000000"/>
+          <w:sz w:val="24"/>
+          <w:szCs w:val="24"/>
+          <w:u w:val="none"/>
+          <w:shd w:fill="auto" w:val="clear"/>
+          <w:vertAlign w:val="baseline"/>
+          <w:rtl w:val="0"/>
+        </w:rPr>
+        <w:t xml:space="preserve"> </w:t>
       </w:r>
     </w:p>
     <w:p>
@@ -1051,7 +1441,101 @@
           <w:vertAlign w:val="baseline"/>
           <w:rtl w:val="0"/>
         </w:rPr>
-        <w:t xml:space="preserve">For chatting between clients, we will want a message class that holds information such as  “Message contents”, “Time”, “Username of sender” things like this. The GUI team will be  responsible for collecting the users message and calling one our SendMessage(Message  msg) function and passing a message object to us. From there we will need to format this  information into a byte pattern which we can decode later and place this information into a  local variable within the Networking class called something like “msgToBeSent” for the  data to be sent by the connection when it is ready( Multithreading means we can’t force  things to happen when we want to, but instead we wait until its ready).  </w:t>
+        <w:t xml:space="preserve">For chatting between clients, we will want a message class that holds information such as  “Message contents”, “Time”, “Username of sender” things like this. The GUI team will be  responsible for collecting the </w:t>
+      </w:r>
+      <w:ins w:author="Hannah Xia" w:id="12" w:date="2024-11-13T20:24:58Z">
+        <w:r>
+          <w:rPr>
+            <w:rFonts w:ascii="Arial" w:cs="Arial" w:eastAsia="Arial" w:hAnsi="Arial"/>
+            <w:b w:val="0"/>
+            <w:i w:val="0"/>
+            <w:smallCaps w:val="0"/>
+            <w:strike w:val="0"/>
+            <w:color w:val="000000"/>
+            <w:sz w:val="24"/>
+            <w:szCs w:val="24"/>
+            <w:u w:val="none"/>
+            <w:shd w:fill="auto" w:val="clear"/>
+            <w:vertAlign w:val="baseline"/>
+            <w:rtl w:val="0"/>
+          </w:rPr>
+          <w:t xml:space="preserve">user's</w:t>
+        </w:r>
+      </w:ins>
+      <w:del w:author="Hannah Xia" w:id="12" w:date="2024-11-13T20:24:58Z">
+        <w:r>
+          <w:rPr>
+            <w:rFonts w:ascii="Arial" w:cs="Arial" w:eastAsia="Arial" w:hAnsi="Arial"/>
+            <w:b w:val="0"/>
+            <w:i w:val="0"/>
+            <w:smallCaps w:val="0"/>
+            <w:strike w:val="0"/>
+            <w:color w:val="000000"/>
+            <w:sz w:val="24"/>
+            <w:szCs w:val="24"/>
+            <w:u w:val="none"/>
+            <w:shd w:fill="auto" w:val="clear"/>
+            <w:vertAlign w:val="baseline"/>
+            <w:rtl w:val="0"/>
+          </w:rPr>
+          <w:delText xml:space="preserve">users</w:delText>
+        </w:r>
+      </w:del>
+      <w:r>
+        <w:rPr>
+          <w:rFonts w:ascii="Arial" w:cs="Arial" w:eastAsia="Arial" w:hAnsi="Arial"/>
+          <w:b w:val="0"/>
+          <w:i w:val="0"/>
+          <w:smallCaps w:val="0"/>
+          <w:strike w:val="0"/>
+          <w:color w:val="000000"/>
+          <w:sz w:val="24"/>
+          <w:szCs w:val="24"/>
+          <w:u w:val="none"/>
+          <w:shd w:fill="auto" w:val="clear"/>
+          <w:vertAlign w:val="baseline"/>
+          <w:rtl w:val="0"/>
+        </w:rPr>
+        <w:t xml:space="preserve"> message and calling one our SendMessage(</w:t>
+      </w:r>
+      <w:commentRangeStart w:id="2"/>
+      <w:r>
+        <w:rPr>
+          <w:rFonts w:ascii="Arial" w:cs="Arial" w:eastAsia="Arial" w:hAnsi="Arial"/>
+          <w:b w:val="0"/>
+          <w:i w:val="0"/>
+          <w:smallCaps w:val="0"/>
+          <w:strike w:val="0"/>
+          <w:color w:val="000000"/>
+          <w:sz w:val="24"/>
+          <w:szCs w:val="24"/>
+          <w:u w:val="none"/>
+          <w:shd w:fill="auto" w:val="clear"/>
+          <w:vertAlign w:val="baseline"/>
+          <w:rtl w:val="0"/>
+        </w:rPr>
+        <w:t xml:space="preserve">Message  msg)</w:t>
+      </w:r>
+      <w:commentRangeEnd w:id="2"/>
+      <w:r>
+        <w:commentReference w:id="2"/>
+      </w:r>
+      <w:r>
+        <w:rPr>
+          <w:rFonts w:ascii="Arial" w:cs="Arial" w:eastAsia="Arial" w:hAnsi="Arial"/>
+          <w:b w:val="0"/>
+          <w:i w:val="0"/>
+          <w:smallCaps w:val="0"/>
+          <w:strike w:val="0"/>
+          <w:color w:val="000000"/>
+          <w:sz w:val="24"/>
+          <w:szCs w:val="24"/>
+          <w:u w:val="none"/>
+          <w:shd w:fill="auto" w:val="clear"/>
+          <w:vertAlign w:val="baseline"/>
+          <w:rtl w:val="0"/>
+        </w:rPr>
+        <w:t xml:space="preserve"> function and passing a message object to us. From there we will need to format this  information into a byte pattern which we can decode later and place this information into a  local variable within the Networking class called something like “msgToBeSent” for the  data to be sent by the connection when it is ready( Multithreading means we can’t force  things to happen when we want to, but instead we wait until its ready).  </w:t>
       </w:r>
     </w:p>
     <w:p>
@@ -1487,22 +1971,44 @@
           <w:vertAlign w:val="baseline"/>
         </w:rPr>
       </w:pPr>
-      <w:r>
-        <w:rPr>
-          <w:rFonts w:ascii="Arial" w:cs="Arial" w:eastAsia="Arial" w:hAnsi="Arial"/>
-          <w:b w:val="0"/>
-          <w:i w:val="0"/>
-          <w:smallCaps w:val="0"/>
-          <w:strike w:val="0"/>
-          <w:color w:val="000000"/>
-          <w:sz w:val="24"/>
-          <w:szCs w:val="24"/>
-          <w:u w:val="none"/>
-          <w:shd w:fill="auto" w:val="clear"/>
-          <w:vertAlign w:val="baseline"/>
-          <w:rtl w:val="0"/>
-        </w:rPr>
-        <w:t xml:space="preserve">The main networking loop must be multithreaded as networking spends a lot of its time  waiting for a packet, and while waiting no other code can be executed, thus we must have  it in another thread. This means that our networking class will </w:t>
+      <w:commentRangeStart w:id="4"/>
+      <w:r>
+        <w:rPr>
+          <w:rFonts w:ascii="Arial" w:cs="Arial" w:eastAsia="Arial" w:hAnsi="Arial"/>
+          <w:b w:val="0"/>
+          <w:i w:val="0"/>
+          <w:smallCaps w:val="0"/>
+          <w:strike w:val="0"/>
+          <w:color w:val="000000"/>
+          <w:sz w:val="24"/>
+          <w:szCs w:val="24"/>
+          <w:u w:val="none"/>
+          <w:shd w:fill="auto" w:val="clear"/>
+          <w:vertAlign w:val="baseline"/>
+          <w:rtl w:val="0"/>
+        </w:rPr>
+        <w:t xml:space="preserve">The main networking loop must</w:t>
+      </w:r>
+      <w:commentRangeEnd w:id="4"/>
+      <w:r>
+        <w:commentReference w:id="4"/>
+      </w:r>
+      <w:r>
+        <w:rPr>
+          <w:rFonts w:ascii="Arial" w:cs="Arial" w:eastAsia="Arial" w:hAnsi="Arial"/>
+          <w:b w:val="0"/>
+          <w:i w:val="0"/>
+          <w:smallCaps w:val="0"/>
+          <w:strike w:val="0"/>
+          <w:color w:val="000000"/>
+          <w:sz w:val="24"/>
+          <w:szCs w:val="24"/>
+          <w:u w:val="none"/>
+          <w:shd w:fill="auto" w:val="clear"/>
+          <w:vertAlign w:val="baseline"/>
+          <w:rtl w:val="0"/>
+        </w:rPr>
+        <w:t xml:space="preserve"> be multithreaded as networking spends a lot of its time  waiting for a packet, and while waiting no other code can be executed, thus we must have  it in another thread. This means that our networking class will </w:t>
       </w:r>
       <w:r>
         <w:rPr>
@@ -1996,7 +2502,7 @@
           <w:vertAlign w:val="baseline"/>
         </w:rPr>
       </w:pPr>
-      <w:commentRangeStart w:id="4"/>
+      <w:commentRangeStart w:id="5"/>
       <w:r>
         <w:rPr>
           <w:rFonts w:ascii="Arial" w:cs="Arial" w:eastAsia="Arial" w:hAnsi="Arial"/>
@@ -2014,29 +2520,63 @@
         </w:rPr>
         <w:t xml:space="preserve">Feel free to recommend another method of sending our data on the network</w:t>
       </w:r>
-      <w:commentRangeEnd w:id="4"/>
-      <w:r>
-        <w:commentReference w:id="4"/>
-      </w:r>
-      <w:r>
-        <w:rPr>
-          <w:rFonts w:ascii="Arial" w:cs="Arial" w:eastAsia="Arial" w:hAnsi="Arial"/>
-          <w:b w:val="0"/>
-          <w:i w:val="0"/>
-          <w:smallCaps w:val="0"/>
-          <w:strike w:val="0"/>
-          <w:color w:val="000000"/>
-          <w:sz w:val="24"/>
-          <w:szCs w:val="24"/>
-          <w:u w:val="none"/>
-          <w:shd w:fill="auto" w:val="clear"/>
-          <w:vertAlign w:val="baseline"/>
-          <w:rtl w:val="0"/>
-        </w:rPr>
-        <w:t xml:space="preserve">, I thought this  up in the </w:t>
-      </w:r>
-      <w:commentRangeStart w:id="5"/>
-      <w:commentRangeStart w:id="6"/>
+      <w:commentRangeEnd w:id="5"/>
+      <w:r>
+        <w:commentReference w:id="5"/>
+      </w:r>
+      <w:r>
+        <w:rPr>
+          <w:rFonts w:ascii="Arial" w:cs="Arial" w:eastAsia="Arial" w:hAnsi="Arial"/>
+          <w:b w:val="0"/>
+          <w:i w:val="0"/>
+          <w:smallCaps w:val="0"/>
+          <w:strike w:val="0"/>
+          <w:color w:val="000000"/>
+          <w:sz w:val="24"/>
+          <w:szCs w:val="24"/>
+          <w:u w:val="none"/>
+          <w:shd w:fill="auto" w:val="clear"/>
+          <w:vertAlign w:val="baseline"/>
+          <w:rtl w:val="0"/>
+        </w:rPr>
+        <w:t xml:space="preserve">, I thought this </w:t>
+      </w:r>
+      <w:del w:author="Hannah Xia" w:id="13" w:date="2024-11-13T19:59:13Z">
+        <w:r>
+          <w:rPr>
+            <w:rFonts w:ascii="Arial" w:cs="Arial" w:eastAsia="Arial" w:hAnsi="Arial"/>
+            <w:b w:val="0"/>
+            <w:i w:val="0"/>
+            <w:smallCaps w:val="0"/>
+            <w:strike w:val="0"/>
+            <w:color w:val="000000"/>
+            <w:sz w:val="24"/>
+            <w:szCs w:val="24"/>
+            <w:u w:val="none"/>
+            <w:shd w:fill="auto" w:val="clear"/>
+            <w:vertAlign w:val="baseline"/>
+            <w:rtl w:val="0"/>
+          </w:rPr>
+          <w:delText xml:space="preserve"> </w:delText>
+        </w:r>
+      </w:del>
+      <w:r>
+        <w:rPr>
+          <w:rFonts w:ascii="Arial" w:cs="Arial" w:eastAsia="Arial" w:hAnsi="Arial"/>
+          <w:b w:val="0"/>
+          <w:i w:val="0"/>
+          <w:smallCaps w:val="0"/>
+          <w:strike w:val="0"/>
+          <w:color w:val="000000"/>
+          <w:sz w:val="24"/>
+          <w:szCs w:val="24"/>
+          <w:u w:val="none"/>
+          <w:shd w:fill="auto" w:val="clear"/>
+          <w:vertAlign w:val="baseline"/>
+          <w:rtl w:val="0"/>
+        </w:rPr>
+        <w:t xml:space="preserve">up in the </w:t>
+      </w:r>
       <w:r>
         <w:rPr>
           <w:rFonts w:ascii="Arial" w:cs="Arial" w:eastAsia="Arial" w:hAnsi="Arial"/>
@@ -2053,14 +2593,6 @@
           <w:rtl w:val="0"/>
         </w:rPr>
         <w:t xml:space="preserve">shower lol</w:t>
-      </w:r>
-      <w:commentRangeEnd w:id="5"/>
-      <w:r>
-        <w:commentReference w:id="5"/>
-      </w:r>
-      <w:commentRangeEnd w:id="6"/>
-      <w:r>
-        <w:commentReference w:id="6"/>
       </w:r>
       <w:r>
         <w:rPr>
@@ -2505,7 +3037,7 @@
           <w:vertAlign w:val="baseline"/>
         </w:rPr>
       </w:pPr>
-      <w:commentRangeStart w:id="7"/>
+      <w:commentRangeStart w:id="6"/>
       <w:r>
         <w:rPr>
           <w:rFonts w:ascii="Arial" w:cs="Arial" w:eastAsia="Arial" w:hAnsi="Arial"/>
@@ -2523,9 +3055,9 @@
         </w:rPr>
         <w:t xml:space="preserve">The Server-Side Loop </w:t>
       </w:r>
-      <w:commentRangeEnd w:id="7"/>
-      <w:r>
-        <w:commentReference w:id="7"/>
+      <w:commentRangeEnd w:id="6"/>
+      <w:r>
+        <w:commentReference w:id="6"/>
       </w:r>
       <w:r>
         <w:rPr>
@@ -2564,6 +3096,7 @@
           <w:vertAlign w:val="baseline"/>
         </w:rPr>
       </w:pPr>
+      <w:commentRangeStart w:id="7"/>
       <w:r>
         <w:rPr>
           <w:rFonts w:ascii="Arial" w:cs="Arial" w:eastAsia="Arial" w:hAnsi="Arial"/>
@@ -2580,6 +3113,15 @@
           <w:rtl w:val="0"/>
         </w:rPr>
         <w:t xml:space="preserve">The server-side loop is not our top priority, but I do think we can get it done within the time  frame, It will consist of 3 loops all running on different threads at the same time </w:t>
+      </w:r>
+      <w:commentRangeEnd w:id="7"/>
+      <w:r>
+        <w:commentReference w:id="7"/>
+      </w:r>
+      <w:r>
+        <w:rPr>
+          <w:rtl w:val="0"/>
+        </w:rPr>
       </w:r>
     </w:p>
     <w:p>
@@ -2677,7 +3219,62 @@
           <w:vertAlign w:val="baseline"/>
           <w:rtl w:val="0"/>
         </w:rPr>
-        <w:t xml:space="preserve">The Second loop is our authentication loop, it will compare the given username and  password with the username and pass it has on file. This loop will also be responsible for  the creating new users and adding them to the file </w:t>
+        <w:t xml:space="preserve">The Second loop is our authentication loop, it will compare the given username and  password with the username and pass </w:t>
+      </w:r>
+      <w:ins w:author="Hannah Xia" w:id="14" w:date="2024-11-13T20:26:02Z">
+        <w:r>
+          <w:rPr>
+            <w:rFonts w:ascii="Arial" w:cs="Arial" w:eastAsia="Arial" w:hAnsi="Arial"/>
+            <w:b w:val="0"/>
+            <w:i w:val="0"/>
+            <w:smallCaps w:val="0"/>
+            <w:strike w:val="0"/>
+            <w:color w:val="000000"/>
+            <w:sz w:val="24"/>
+            <w:szCs w:val="24"/>
+            <w:u w:val="none"/>
+            <w:shd w:fill="auto" w:val="clear"/>
+            <w:vertAlign w:val="baseline"/>
+            <w:rtl w:val="0"/>
+          </w:rPr>
+          <w:t xml:space="preserve">it on the</w:t>
+        </w:r>
+      </w:ins>
+      <w:del w:author="Hannah Xia" w:id="14" w:date="2024-11-13T20:26:02Z">
+        <w:r>
+          <w:rPr>
+            <w:rFonts w:ascii="Arial" w:cs="Arial" w:eastAsia="Arial" w:hAnsi="Arial"/>
+            <w:b w:val="0"/>
+            <w:i w:val="0"/>
+            <w:smallCaps w:val="0"/>
+            <w:strike w:val="0"/>
+            <w:color w:val="000000"/>
+            <w:sz w:val="24"/>
+            <w:szCs w:val="24"/>
+            <w:u w:val="none"/>
+            <w:shd w:fill="auto" w:val="clear"/>
+            <w:vertAlign w:val="baseline"/>
+            <w:rtl w:val="0"/>
+          </w:rPr>
+          <w:delText xml:space="preserve">it has on</w:delText>
+        </w:r>
+      </w:del>
+      <w:r>
+        <w:rPr>
+          <w:rFonts w:ascii="Arial" w:cs="Arial" w:eastAsia="Arial" w:hAnsi="Arial"/>
+          <w:b w:val="0"/>
+          <w:i w:val="0"/>
+          <w:smallCaps w:val="0"/>
+          <w:strike w:val="0"/>
+          <w:color w:val="000000"/>
+          <w:sz w:val="24"/>
+          <w:szCs w:val="24"/>
+          <w:u w:val="none"/>
+          <w:shd w:fill="auto" w:val="clear"/>
+          <w:vertAlign w:val="baseline"/>
+          <w:rtl w:val="0"/>
+        </w:rPr>
+        <w:t xml:space="preserve"> file. This loop will also be responsible for  the creating new users and adding them to the file </w:t>
       </w:r>
     </w:p>
     <w:p>
@@ -2828,7 +3425,7 @@
 
 <file path=word/comments.xml><?xml version="1.0" encoding="utf-8"?>
 <w:comments xmlns:mc="http://schemas.openxmlformats.org/markup-compatibility/2006" xmlns:o="urn:schemas-microsoft-com:office:office" xmlns:r="http://schemas.openxmlformats.org/officeDocument/2006/relationships" xmlns:m="http://schemas.openxmlformats.org/officeDocument/2006/math" xmlns:v="urn:schemas-microsoft-com:vml" xmlns:wp="http://schemas.openxmlformats.org/drawingml/2006/wordprocessingDrawing" xmlns:w10="urn:schemas-microsoft-com:office:word" xmlns:w="http://schemas.openxmlformats.org/wordprocessingml/2006/main" xmlns:wne="http://schemas.microsoft.com/office/word/2006/wordml" xmlns:sl="http://schemas.openxmlformats.org/schemaLibrary/2006/main" xmlns:a="http://schemas.openxmlformats.org/drawingml/2006/main" xmlns:pic="http://schemas.openxmlformats.org/drawingml/2006/picture" xmlns:c="http://schemas.openxmlformats.org/drawingml/2006/chart" xmlns:lc="http://schemas.openxmlformats.org/drawingml/2006/lockedCanvas" xmlns:dgm="http://schemas.openxmlformats.org/drawingml/2006/diagram" xmlns:wps="http://schemas.microsoft.com/office/word/2010/wordprocessingShape" xmlns:wpg="http://schemas.microsoft.com/office/word/2010/wordprocessingGroup" xmlns:w14="http://schemas.microsoft.com/office/word/2010/wordml" xmlns:w15="http://schemas.microsoft.com/office/word/2012/wordml" xmlns:w16="http://schemas.microsoft.com/office/word/2018/wordml" xmlns:w16cex="http://schemas.microsoft.com/office/word/2018/wordml/cex" xmlns:w16cid="http://schemas.microsoft.com/office/word/2016/wordml/cid" xmlns="http://schemas.microsoft.com/office/tasks/2019/documenttasks" xmlns:cr="http://schemas.microsoft.com/office/comments/2020/reactions">
-  <w:comment w:author="Hannah Xia" w:id="4" w:date="2024-11-11T04:04:37Z">
+  <w:comment w:author="Hannah Xia" w:id="5" w:date="2024-11-11T04:04:37Z">
     <w:p>
       <w:pPr>
         <w:keepNext w:val="0"/>
@@ -2879,7 +3476,7 @@
       </w:r>
     </w:p>
   </w:comment>
-  <w:comment w:author="Hannah Xia" w:id="5" w:date="2024-11-11T04:00:07Z">
+  <w:comment w:author="Hannah Xia" w:id="4" w:date="2024-11-13T20:16:49Z">
     <w:p>
       <w:pPr>
         <w:keepNext w:val="0"/>
@@ -2926,7 +3523,7 @@
           <w:vertAlign w:val="baseline"/>
           <w:rtl w:val="0"/>
         </w:rPr>
-        <w:t xml:space="preserve">i can tell. jk lmfao.</w:t>
+        <w:t xml:space="preserve">Using a "main loop" for all of networking function isn't the best way to do this because it's hard to maintain, not to mention the loop as to be run anytime you need to access the database (bad running time).</w:t>
       </w:r>
     </w:p>
     <w:p>
@@ -3012,11 +3609,9 @@
           <w:vertAlign w:val="baseline"/>
           <w:rtl w:val="0"/>
         </w:rPr>
-        <w:t xml:space="preserve">(ill delete this when we're done srry it was an opportunity i could not pass up)</w:t>
-      </w:r>
-    </w:p>
-  </w:comment>
-  <w:comment w:author="Morteza Faraji" w:id="6" w:date="2024-11-12T02:37:12Z">
+        <w:t xml:space="preserve">Consider using a singleton pattern because there's going to be multiple objects trying access the same network data. If there is no use of Singleton, you could run into problems where you have multiple classes trying to access the same data base being impossible because the database would reset every time a new person tries to access it.</w:t>
+      </w:r>
+    </w:p>
     <w:p>
       <w:pPr>
         <w:keepNext w:val="0"/>
@@ -3050,6 +3645,28 @@
       </w:pPr>
       <w:r>
         <w:rPr>
+          <w:rtl w:val="0"/>
+        </w:rPr>
+      </w:r>
+    </w:p>
+    <w:p>
+      <w:pPr>
+        <w:keepNext w:val="0"/>
+        <w:keepLines w:val="0"/>
+        <w:pageBreakBefore w:val="0"/>
+        <w:widowControl w:val="0"/>
+        <w:pBdr>
+          <w:top w:space="0" w:sz="0" w:val="nil"/>
+          <w:left w:space="0" w:sz="0" w:val="nil"/>
+          <w:bottom w:space="0" w:sz="0" w:val="nil"/>
+          <w:right w:space="0" w:sz="0" w:val="nil"/>
+          <w:between w:space="0" w:sz="0" w:val="nil"/>
+        </w:pBdr>
+        <w:shd w:fill="auto" w:val="clear"/>
+        <w:spacing w:after="0" w:before="0" w:line="240" w:lineRule="auto"/>
+        <w:ind w:left="0" w:right="0" w:firstLine="0"/>
+        <w:jc w:val="left"/>
+        <w:rPr>
           <w:rFonts w:ascii="Arial" w:cs="Arial" w:eastAsia="Arial" w:hAnsi="Arial"/>
           <w:b w:val="0"/>
           <w:i w:val="0"/>
@@ -3061,13 +3678,14 @@
           <w:u w:val="none"/>
           <w:shd w:fill="auto" w:val="clear"/>
           <w:vertAlign w:val="baseline"/>
-          <w:rtl w:val="0"/>
-        </w:rPr>
-        <w:t xml:space="preserve">LMAOOOOOOOOOOO</w:t>
-      </w:r>
-    </w:p>
-  </w:comment>
-  <w:comment w:author="Hannah Xia" w:id="2" w:date="2024-11-11T03:59:18Z">
+        </w:rPr>
+      </w:pPr>
+      <w:r>
+        <w:rPr>
+          <w:rtl w:val="0"/>
+        </w:rPr>
+      </w:r>
+    </w:p>
     <w:p>
       <w:pPr>
         <w:keepNext w:val="0"/>
@@ -3114,9 +3732,11 @@
           <w:vertAlign w:val="baseline"/>
           <w:rtl w:val="0"/>
         </w:rPr>
-        <w:t xml:space="preserve">Leaderboard should have these functions but consider only having to retrieve (send/update) after a match has concluded instead of regularly sending over the stored leaderboard data. Or am I not understanding this correctly?</w:t>
-      </w:r>
-    </w:p>
+        <w:t xml:space="preserve">Be careful with Singleton though, you could run into issues that happen when singleton is used if you make your networking code too complicated (Race condition, test writing, etc).</w:t>
+      </w:r>
+    </w:p>
+  </w:comment>
+  <w:comment w:author="Hannah Xia" w:id="0" w:date="2024-11-11T03:49:26Z">
     <w:p>
       <w:pPr>
         <w:keepNext w:val="0"/>
@@ -3150,10 +3770,24 @@
       </w:pPr>
       <w:r>
         <w:rPr>
-          <w:rtl w:val="0"/>
-        </w:rPr>
-      </w:r>
-    </w:p>
+          <w:rFonts w:ascii="Arial" w:cs="Arial" w:eastAsia="Arial" w:hAnsi="Arial"/>
+          <w:b w:val="0"/>
+          <w:i w:val="0"/>
+          <w:smallCaps w:val="0"/>
+          <w:strike w:val="0"/>
+          <w:color w:val="000000"/>
+          <w:sz w:val="22"/>
+          <w:szCs w:val="22"/>
+          <w:u w:val="none"/>
+          <w:shd w:fill="auto" w:val="clear"/>
+          <w:vertAlign w:val="baseline"/>
+          <w:rtl w:val="0"/>
+        </w:rPr>
+        <w:t xml:space="preserve">Consider including matchmaking as a major aspect in networking. Preferably, have a class dedicated to handle how you would want to match players instead of loops...</w:t>
+      </w:r>
+    </w:p>
+  </w:comment>
+  <w:comment w:author="Hannah Xia" w:id="3" w:date="2024-11-11T03:46:50Z">
     <w:p>
       <w:pPr>
         <w:keepNext w:val="0"/>
@@ -3200,11 +3834,9 @@
           <w:vertAlign w:val="baseline"/>
           <w:rtl w:val="0"/>
         </w:rPr>
-        <w:t xml:space="preserve">Decoding is a bit excessive, why send things in byte form when it can be stored in a map?</w:t>
-      </w:r>
-    </w:p>
-  </w:comment>
-  <w:comment w:author="Hannah Xia" w:id="1" w:date="2024-11-11T03:49:26Z">
+        <w:t xml:space="preserve">This is good but consider a termination method that checks if the conditions for termination has been met. It should be included here because it should be checked every time after a user has made a move.</w:t>
+      </w:r>
+    </w:p>
     <w:p>
       <w:pPr>
         <w:keepNext w:val="0"/>
@@ -3238,6 +3870,28 @@
       </w:pPr>
       <w:r>
         <w:rPr>
+          <w:rtl w:val="0"/>
+        </w:rPr>
+      </w:r>
+    </w:p>
+    <w:p>
+      <w:pPr>
+        <w:keepNext w:val="0"/>
+        <w:keepLines w:val="0"/>
+        <w:pageBreakBefore w:val="0"/>
+        <w:widowControl w:val="0"/>
+        <w:pBdr>
+          <w:top w:space="0" w:sz="0" w:val="nil"/>
+          <w:left w:space="0" w:sz="0" w:val="nil"/>
+          <w:bottom w:space="0" w:sz="0" w:val="nil"/>
+          <w:right w:space="0" w:sz="0" w:val="nil"/>
+          <w:between w:space="0" w:sz="0" w:val="nil"/>
+        </w:pBdr>
+        <w:shd w:fill="auto" w:val="clear"/>
+        <w:spacing w:after="0" w:before="0" w:line="240" w:lineRule="auto"/>
+        <w:ind w:left="0" w:right="0" w:firstLine="0"/>
+        <w:jc w:val="left"/>
+        <w:rPr>
           <w:rFonts w:ascii="Arial" w:cs="Arial" w:eastAsia="Arial" w:hAnsi="Arial"/>
           <w:b w:val="0"/>
           <w:i w:val="0"/>
@@ -3249,13 +3903,28 @@
           <w:u w:val="none"/>
           <w:shd w:fill="auto" w:val="clear"/>
           <w:vertAlign w:val="baseline"/>
-          <w:rtl w:val="0"/>
-        </w:rPr>
-        <w:t xml:space="preserve">Consider including matchmaking as a major aspect in networking. Preferably, have a class dedicated to handle how you would want to match players instead of loops...</w:t>
+        </w:rPr>
+      </w:pPr>
+      <w:r>
+        <w:rPr>
+          <w:rFonts w:ascii="Arial" w:cs="Arial" w:eastAsia="Arial" w:hAnsi="Arial"/>
+          <w:b w:val="0"/>
+          <w:i w:val="0"/>
+          <w:smallCaps w:val="0"/>
+          <w:strike w:val="0"/>
+          <w:color w:val="000000"/>
+          <w:sz w:val="22"/>
+          <w:szCs w:val="22"/>
+          <w:u w:val="none"/>
+          <w:shd w:fill="auto" w:val="clear"/>
+          <w:vertAlign w:val="baseline"/>
+          <w:rtl w:val="0"/>
+        </w:rPr>
+        <w:t xml:space="preserve">For example, in a game like tictactoe, if there is a row of 3 x's o's, or the game is cat, the game will terminate.</w:t>
       </w:r>
     </w:p>
   </w:comment>
-  <w:comment w:author="Hannah Xia" w:id="0" w:date="2024-11-11T04:01:58Z">
+  <w:comment w:author="Hannah Xia" w:id="6" w:date="2024-11-11T03:52:20Z">
     <w:p>
       <w:pPr>
         <w:keepNext w:val="0"/>
@@ -3302,11 +3971,11 @@
           <w:vertAlign w:val="baseline"/>
           <w:rtl w:val="0"/>
         </w:rPr>
-        <w:t xml:space="preserve">guys this whole set up outline thing is confusing tf out of me like what are these loops..., i will continue to brave this another day o7</w:t>
+        <w:t xml:space="preserve">Temporary Note: I feel like this is a little weird, like i think the networking class itself can just do all of this? What do y'all think?</w:t>
       </w:r>
     </w:p>
   </w:comment>
-  <w:comment w:author="Hannah Xia" w:id="3" w:date="2024-11-11T03:46:50Z">
+  <w:comment w:author="Hannah Xia" w:id="7" w:date="2024-11-13T20:21:51Z">
     <w:p>
       <w:pPr>
         <w:keepNext w:val="0"/>
@@ -3353,9 +4022,11 @@
           <w:vertAlign w:val="baseline"/>
           <w:rtl w:val="0"/>
         </w:rPr>
-        <w:t xml:space="preserve">This is good but consider a termination method that checks if the conditions for termination has been met. It should be included here because it should be checked every time after a user has made a move.</w:t>
-      </w:r>
-    </w:p>
+        <w:t xml:space="preserve">This is a bit of a risk. Using so many loops will make debugging and coding difficult. Be mindful of how much time you have to code.</w:t>
+      </w:r>
+    </w:p>
+  </w:comment>
+  <w:comment w:author="Hannah Xia" w:id="1" w:date="2024-11-11T03:59:18Z">
     <w:p>
       <w:pPr>
         <w:keepNext w:val="0"/>
@@ -3389,8 +4060,20 @@
       </w:pPr>
       <w:r>
         <w:rPr>
-          <w:rtl w:val="0"/>
-        </w:rPr>
+          <w:rFonts w:ascii="Arial" w:cs="Arial" w:eastAsia="Arial" w:hAnsi="Arial"/>
+          <w:b w:val="0"/>
+          <w:i w:val="0"/>
+          <w:smallCaps w:val="0"/>
+          <w:strike w:val="0"/>
+          <w:color w:val="000000"/>
+          <w:sz w:val="22"/>
+          <w:szCs w:val="22"/>
+          <w:u w:val="none"/>
+          <w:shd w:fill="auto" w:val="clear"/>
+          <w:vertAlign w:val="baseline"/>
+          <w:rtl w:val="0"/>
+        </w:rPr>
+        <w:t xml:space="preserve">Leaderboard should have these functions but consider only having to retrieve (send/update) after a match has concluded instead of regularly sending over the stored leaderboard data. Or am I not understanding this correctly?</w:t>
       </w:r>
     </w:p>
     <w:p>
@@ -3426,6 +4109,28 @@
       </w:pPr>
       <w:r>
         <w:rPr>
+          <w:rtl w:val="0"/>
+        </w:rPr>
+      </w:r>
+    </w:p>
+    <w:p>
+      <w:pPr>
+        <w:keepNext w:val="0"/>
+        <w:keepLines w:val="0"/>
+        <w:pageBreakBefore w:val="0"/>
+        <w:widowControl w:val="0"/>
+        <w:pBdr>
+          <w:top w:space="0" w:sz="0" w:val="nil"/>
+          <w:left w:space="0" w:sz="0" w:val="nil"/>
+          <w:bottom w:space="0" w:sz="0" w:val="nil"/>
+          <w:right w:space="0" w:sz="0" w:val="nil"/>
+          <w:between w:space="0" w:sz="0" w:val="nil"/>
+        </w:pBdr>
+        <w:shd w:fill="auto" w:val="clear"/>
+        <w:spacing w:after="0" w:before="0" w:line="240" w:lineRule="auto"/>
+        <w:ind w:left="0" w:right="0" w:firstLine="0"/>
+        <w:jc w:val="left"/>
+        <w:rPr>
           <w:rFonts w:ascii="Arial" w:cs="Arial" w:eastAsia="Arial" w:hAnsi="Arial"/>
           <w:b w:val="0"/>
           <w:i w:val="0"/>
@@ -3437,13 +4142,28 @@
           <w:u w:val="none"/>
           <w:shd w:fill="auto" w:val="clear"/>
           <w:vertAlign w:val="baseline"/>
-          <w:rtl w:val="0"/>
-        </w:rPr>
-        <w:t xml:space="preserve">For example, in a game like tictactoe, if there is a row of 3 x's o's, or the game is cat, the game will terminate.</w:t>
+        </w:rPr>
+      </w:pPr>
+      <w:r>
+        <w:rPr>
+          <w:rFonts w:ascii="Arial" w:cs="Arial" w:eastAsia="Arial" w:hAnsi="Arial"/>
+          <w:b w:val="0"/>
+          <w:i w:val="0"/>
+          <w:smallCaps w:val="0"/>
+          <w:strike w:val="0"/>
+          <w:color w:val="000000"/>
+          <w:sz w:val="22"/>
+          <w:szCs w:val="22"/>
+          <w:u w:val="none"/>
+          <w:shd w:fill="auto" w:val="clear"/>
+          <w:vertAlign w:val="baseline"/>
+          <w:rtl w:val="0"/>
+        </w:rPr>
+        <w:t xml:space="preserve">Decoding is a bit excessive, why send things in byte form when it can be stored in a map?</w:t>
       </w:r>
     </w:p>
   </w:comment>
-  <w:comment w:author="Hannah Xia" w:id="7" w:date="2024-11-11T03:52:20Z">
+  <w:comment w:author="Hannah Xia" w:id="2" w:date="2024-11-13T20:12:06Z">
     <w:p>
       <w:pPr>
         <w:keepNext w:val="0"/>
@@ -3490,7 +4210,7 @@
           <w:vertAlign w:val="baseline"/>
           <w:rtl w:val="0"/>
         </w:rPr>
-        <w:t xml:space="preserve">Temporary Note: I feel like this is a little weird, like i think the networking class itself can just do all of this? What do y'all think?</w:t>
+        <w:t xml:space="preserve">This didn't seem to add up to your structure diagram planning, there was no "Message" object class so make sure your diagram has that at least or edit your classes in the planning doc.</w:t>
       </w:r>
     </w:p>
   </w:comment>

</xml_diff>

<commit_message>
Replace Networking_Outline.docx with new Samuel E changes
</commit_message>
<xml_diff>
--- a/Iteration_2/Echo_Networking/Networking_Outline.docx
+++ b/Iteration_2/Echo_Networking/Networking_Outline.docx
@@ -66,6 +66,11 @@
           <w:rtl w:val="0"/>
         </w:rPr>
         <w:t xml:space="preserve"> are 5 major aspects of the networking portion of the code </w:t>
+      </w:r>
+      <w:r>
+        <w:rPr>
+          <w:rtl w:val="0"/>
+        </w:rPr>
       </w:r>
     </w:p>
     <w:p>
@@ -2988,6 +2993,8 @@
           <w:vertAlign w:val="baseline"/>
         </w:rPr>
       </w:pPr>
+      <w:commentRangeStart w:id="6"/>
+      <w:commentRangeStart w:id="7"/>
       <w:r>
         <w:rPr>
           <w:rFonts w:ascii="Arial" w:cs="Arial" w:eastAsia="Arial" w:hAnsi="Arial"/>
@@ -3004,6 +3011,19 @@
           <w:rtl w:val="0"/>
         </w:rPr>
         <w:t xml:space="preserve">And our last option that I can think of right now is we could look for a library that has a  simplified networking protocol and use that </w:t>
+      </w:r>
+      <w:commentRangeEnd w:id="6"/>
+      <w:r>
+        <w:commentReference w:id="6"/>
+      </w:r>
+      <w:commentRangeEnd w:id="7"/>
+      <w:r>
+        <w:commentReference w:id="7"/>
+      </w:r>
+      <w:r>
+        <w:rPr>
+          <w:rtl w:val="0"/>
+        </w:rPr>
       </w:r>
     </w:p>
     <w:p>
@@ -3037,7 +3057,7 @@
           <w:vertAlign w:val="baseline"/>
         </w:rPr>
       </w:pPr>
-      <w:commentRangeStart w:id="6"/>
+      <w:commentRangeStart w:id="8"/>
       <w:r>
         <w:rPr>
           <w:rFonts w:ascii="Arial" w:cs="Arial" w:eastAsia="Arial" w:hAnsi="Arial"/>
@@ -3055,9 +3075,9 @@
         </w:rPr>
         <w:t xml:space="preserve">The Server-Side Loop </w:t>
       </w:r>
-      <w:commentRangeEnd w:id="6"/>
-      <w:r>
-        <w:commentReference w:id="6"/>
+      <w:commentRangeEnd w:id="8"/>
+      <w:r>
+        <w:commentReference w:id="8"/>
       </w:r>
       <w:r>
         <w:rPr>
@@ -3096,7 +3116,7 @@
           <w:vertAlign w:val="baseline"/>
         </w:rPr>
       </w:pPr>
-      <w:commentRangeStart w:id="7"/>
+      <w:commentRangeStart w:id="9"/>
       <w:r>
         <w:rPr>
           <w:rFonts w:ascii="Arial" w:cs="Arial" w:eastAsia="Arial" w:hAnsi="Arial"/>
@@ -3114,9 +3134,9 @@
         </w:rPr>
         <w:t xml:space="preserve">The server-side loop is not our top priority, but I do think we can get it done within the time  frame, It will consist of 3 loops all running on different threads at the same time </w:t>
       </w:r>
-      <w:commentRangeEnd w:id="7"/>
-      <w:r>
-        <w:commentReference w:id="7"/>
+      <w:commentRangeEnd w:id="9"/>
+      <w:r>
+        <w:commentReference w:id="9"/>
       </w:r>
       <w:r>
         <w:rPr>
@@ -3924,7 +3944,7 @@
       </w:r>
     </w:p>
   </w:comment>
-  <w:comment w:author="Hannah Xia" w:id="6" w:date="2024-11-11T03:52:20Z">
+  <w:comment w:author="Hannah Xia" w:id="8" w:date="2024-11-11T03:52:20Z">
     <w:p>
       <w:pPr>
         <w:keepNext w:val="0"/>
@@ -3975,7 +3995,7 @@
       </w:r>
     </w:p>
   </w:comment>
-  <w:comment w:author="Hannah Xia" w:id="7" w:date="2024-11-13T20:21:51Z">
+  <w:comment w:author="Hannah Xia" w:id="9" w:date="2024-11-13T20:21:51Z">
     <w:p>
       <w:pPr>
         <w:keepNext w:val="0"/>
@@ -4160,6 +4180,108 @@
           <w:rtl w:val="0"/>
         </w:rPr>
         <w:t xml:space="preserve">Decoding is a bit excessive, why send things in byte form when it can be stored in a map?</w:t>
+      </w:r>
+    </w:p>
+  </w:comment>
+  <w:comment w:author="Samuel Ergando" w:id="6" w:date="2024-11-14T00:51:51Z">
+    <w:p>
+      <w:pPr>
+        <w:keepNext w:val="0"/>
+        <w:keepLines w:val="0"/>
+        <w:pageBreakBefore w:val="0"/>
+        <w:widowControl w:val="0"/>
+        <w:pBdr>
+          <w:top w:space="0" w:sz="0" w:val="nil"/>
+          <w:left w:space="0" w:sz="0" w:val="nil"/>
+          <w:bottom w:space="0" w:sz="0" w:val="nil"/>
+          <w:right w:space="0" w:sz="0" w:val="nil"/>
+          <w:between w:space="0" w:sz="0" w:val="nil"/>
+        </w:pBdr>
+        <w:shd w:fill="auto" w:val="clear"/>
+        <w:spacing w:after="0" w:before="0" w:line="240" w:lineRule="auto"/>
+        <w:ind w:left="0" w:right="0" w:firstLine="0"/>
+        <w:jc w:val="left"/>
+        <w:rPr>
+          <w:rFonts w:ascii="Arial" w:cs="Arial" w:eastAsia="Arial" w:hAnsi="Arial"/>
+          <w:b w:val="0"/>
+          <w:i w:val="0"/>
+          <w:smallCaps w:val="0"/>
+          <w:strike w:val="0"/>
+          <w:color w:val="000000"/>
+          <w:sz w:val="22"/>
+          <w:szCs w:val="22"/>
+          <w:u w:val="none"/>
+          <w:shd w:fill="auto" w:val="clear"/>
+          <w:vertAlign w:val="baseline"/>
+        </w:rPr>
+      </w:pPr>
+      <w:r>
+        <w:rPr>
+          <w:rFonts w:ascii="Arial" w:cs="Arial" w:eastAsia="Arial" w:hAnsi="Arial"/>
+          <w:b w:val="0"/>
+          <w:i w:val="0"/>
+          <w:smallCaps w:val="0"/>
+          <w:strike w:val="0"/>
+          <w:color w:val="000000"/>
+          <w:sz w:val="22"/>
+          <w:szCs w:val="22"/>
+          <w:u w:val="none"/>
+          <w:shd w:fill="auto" w:val="clear"/>
+          <w:vertAlign w:val="baseline"/>
+          <w:rtl w:val="0"/>
+        </w:rPr>
+        <w:t xml:space="preserve">So given the requirements of this project it probably would have been wise to lead with this. I will say that the effort to suggest your own networking protocol is commendable but it's simply to much work. Designing your own protocol is really a project in itself so it's usually wise even in industry to research a network library that works best for your project specifications.</w:t>
+      </w:r>
+    </w:p>
+  </w:comment>
+  <w:comment w:author="Samuel Ergando" w:id="7" w:date="2024-11-14T00:56:55Z">
+    <w:p>
+      <w:pPr>
+        <w:keepNext w:val="0"/>
+        <w:keepLines w:val="0"/>
+        <w:pageBreakBefore w:val="0"/>
+        <w:widowControl w:val="0"/>
+        <w:pBdr>
+          <w:top w:space="0" w:sz="0" w:val="nil"/>
+          <w:left w:space="0" w:sz="0" w:val="nil"/>
+          <w:bottom w:space="0" w:sz="0" w:val="nil"/>
+          <w:right w:space="0" w:sz="0" w:val="nil"/>
+          <w:between w:space="0" w:sz="0" w:val="nil"/>
+        </w:pBdr>
+        <w:shd w:fill="auto" w:val="clear"/>
+        <w:spacing w:after="0" w:before="0" w:line="240" w:lineRule="auto"/>
+        <w:ind w:left="0" w:right="0" w:firstLine="0"/>
+        <w:jc w:val="left"/>
+        <w:rPr>
+          <w:rFonts w:ascii="Arial" w:cs="Arial" w:eastAsia="Arial" w:hAnsi="Arial"/>
+          <w:b w:val="0"/>
+          <w:i w:val="0"/>
+          <w:smallCaps w:val="0"/>
+          <w:strike w:val="0"/>
+          <w:color w:val="000000"/>
+          <w:sz w:val="22"/>
+          <w:szCs w:val="22"/>
+          <w:u w:val="none"/>
+          <w:shd w:fill="auto" w:val="clear"/>
+          <w:vertAlign w:val="baseline"/>
+        </w:rPr>
+      </w:pPr>
+      <w:r>
+        <w:rPr>
+          <w:rFonts w:ascii="Arial" w:cs="Arial" w:eastAsia="Arial" w:hAnsi="Arial"/>
+          <w:b w:val="0"/>
+          <w:i w:val="0"/>
+          <w:smallCaps w:val="0"/>
+          <w:strike w:val="0"/>
+          <w:color w:val="000000"/>
+          <w:sz w:val="22"/>
+          <w:szCs w:val="22"/>
+          <w:u w:val="none"/>
+          <w:shd w:fill="auto" w:val="clear"/>
+          <w:vertAlign w:val="baseline"/>
+          <w:rtl w:val="0"/>
+        </w:rPr>
+        <w:t xml:space="preserve">So for example if you want to implement TCP/UDP in java for your networking protocol then you could use performant libraries like Extasys.</w:t>
       </w:r>
     </w:p>
   </w:comment>

</xml_diff>

<commit_message>
Elaborated and added more to the main comment.
</commit_message>
<xml_diff>
--- a/Iteration_2/Echo_Networking/Networking_Outline.docx
+++ b/Iteration_2/Echo_Networking/Networking_Outline.docx
@@ -4061,6 +4061,301 @@
           <w:rtl w:val="0"/>
         </w:rPr>
         <w:t xml:space="preserve">We certainly appreciate the dedication that the networking team has put into this aspect of the project. However, from a stakeholder/client perspective, the networking team's outline is simply too ambitious. The team has not correctly taken into consideration how long the proposed implementations of the system will take. Creating a dedicated server, while commendable, is extremely "overkill" and effectively "reinvents the wheel." As a client, this is a bit concerning to see. From a software engineering perspective, this outline violates the DRY (Don't Repeat Yourself) principle. For these reasons, we feel that this outline is overly ambitious and undermines the time allotted for implementing features of this scale.</w:t>
+      </w:r>
+    </w:p>
+    <w:p>
+      <w:pPr>
+        <w:keepNext w:val="0"/>
+        <w:keepLines w:val="0"/>
+        <w:pageBreakBefore w:val="0"/>
+        <w:widowControl w:val="0"/>
+        <w:pBdr>
+          <w:top w:space="0" w:sz="0" w:val="nil"/>
+          <w:left w:space="0" w:sz="0" w:val="nil"/>
+          <w:bottom w:space="0" w:sz="0" w:val="nil"/>
+          <w:right w:space="0" w:sz="0" w:val="nil"/>
+          <w:between w:space="0" w:sz="0" w:val="nil"/>
+        </w:pBdr>
+        <w:shd w:fill="auto" w:val="clear"/>
+        <w:spacing w:after="0" w:before="0" w:line="240" w:lineRule="auto"/>
+        <w:ind w:left="0" w:right="0" w:firstLine="0"/>
+        <w:jc w:val="left"/>
+        <w:rPr>
+          <w:rFonts w:ascii="Arial" w:cs="Arial" w:eastAsia="Arial" w:hAnsi="Arial"/>
+          <w:b w:val="0"/>
+          <w:i w:val="0"/>
+          <w:smallCaps w:val="0"/>
+          <w:strike w:val="0"/>
+          <w:color w:val="000000"/>
+          <w:sz w:val="22"/>
+          <w:szCs w:val="22"/>
+          <w:u w:val="none"/>
+          <w:shd w:fill="auto" w:val="clear"/>
+          <w:vertAlign w:val="baseline"/>
+        </w:rPr>
+      </w:pPr>
+      <w:r>
+        <w:rPr>
+          <w:rtl w:val="0"/>
+        </w:rPr>
+      </w:r>
+    </w:p>
+    <w:p>
+      <w:pPr>
+        <w:keepNext w:val="0"/>
+        <w:keepLines w:val="0"/>
+        <w:pageBreakBefore w:val="0"/>
+        <w:widowControl w:val="0"/>
+        <w:pBdr>
+          <w:top w:space="0" w:sz="0" w:val="nil"/>
+          <w:left w:space="0" w:sz="0" w:val="nil"/>
+          <w:bottom w:space="0" w:sz="0" w:val="nil"/>
+          <w:right w:space="0" w:sz="0" w:val="nil"/>
+          <w:between w:space="0" w:sz="0" w:val="nil"/>
+        </w:pBdr>
+        <w:shd w:fill="auto" w:val="clear"/>
+        <w:spacing w:after="0" w:before="0" w:line="240" w:lineRule="auto"/>
+        <w:ind w:left="0" w:right="0" w:firstLine="0"/>
+        <w:jc w:val="left"/>
+        <w:rPr>
+          <w:rFonts w:ascii="Arial" w:cs="Arial" w:eastAsia="Arial" w:hAnsi="Arial"/>
+          <w:b w:val="0"/>
+          <w:i w:val="0"/>
+          <w:smallCaps w:val="0"/>
+          <w:strike w:val="0"/>
+          <w:color w:val="000000"/>
+          <w:sz w:val="22"/>
+          <w:szCs w:val="22"/>
+          <w:u w:val="none"/>
+          <w:shd w:fill="auto" w:val="clear"/>
+          <w:vertAlign w:val="baseline"/>
+        </w:rPr>
+      </w:pPr>
+      <w:r>
+        <w:rPr>
+          <w:rtl w:val="0"/>
+        </w:rPr>
+      </w:r>
+    </w:p>
+    <w:p>
+      <w:pPr>
+        <w:keepNext w:val="0"/>
+        <w:keepLines w:val="0"/>
+        <w:pageBreakBefore w:val="0"/>
+        <w:widowControl w:val="0"/>
+        <w:pBdr>
+          <w:top w:space="0" w:sz="0" w:val="nil"/>
+          <w:left w:space="0" w:sz="0" w:val="nil"/>
+          <w:bottom w:space="0" w:sz="0" w:val="nil"/>
+          <w:right w:space="0" w:sz="0" w:val="nil"/>
+          <w:between w:space="0" w:sz="0" w:val="nil"/>
+        </w:pBdr>
+        <w:shd w:fill="auto" w:val="clear"/>
+        <w:spacing w:after="0" w:before="0" w:line="240" w:lineRule="auto"/>
+        <w:ind w:left="0" w:right="0" w:firstLine="0"/>
+        <w:jc w:val="left"/>
+        <w:rPr>
+          <w:rFonts w:ascii="Arial" w:cs="Arial" w:eastAsia="Arial" w:hAnsi="Arial"/>
+          <w:b w:val="0"/>
+          <w:i w:val="0"/>
+          <w:smallCaps w:val="0"/>
+          <w:strike w:val="0"/>
+          <w:color w:val="000000"/>
+          <w:sz w:val="22"/>
+          <w:szCs w:val="22"/>
+          <w:u w:val="none"/>
+          <w:shd w:fill="auto" w:val="clear"/>
+          <w:vertAlign w:val="baseline"/>
+        </w:rPr>
+      </w:pPr>
+      <w:r>
+        <w:rPr>
+          <w:rFonts w:ascii="Arial" w:cs="Arial" w:eastAsia="Arial" w:hAnsi="Arial"/>
+          <w:b w:val="0"/>
+          <w:i w:val="0"/>
+          <w:smallCaps w:val="0"/>
+          <w:strike w:val="0"/>
+          <w:color w:val="000000"/>
+          <w:sz w:val="22"/>
+          <w:szCs w:val="22"/>
+          <w:u w:val="none"/>
+          <w:shd w:fill="auto" w:val="clear"/>
+          <w:vertAlign w:val="baseline"/>
+          <w:rtl w:val="0"/>
+        </w:rPr>
+        <w:t xml:space="preserve">Another major concern is that this outline implies the networking team is planning to create a server. Consider this quote from the CEO in the letter provided to the team:</w:t>
+      </w:r>
+    </w:p>
+    <w:p>
+      <w:pPr>
+        <w:keepNext w:val="0"/>
+        <w:keepLines w:val="0"/>
+        <w:pageBreakBefore w:val="0"/>
+        <w:widowControl w:val="0"/>
+        <w:pBdr>
+          <w:top w:space="0" w:sz="0" w:val="nil"/>
+          <w:left w:space="0" w:sz="0" w:val="nil"/>
+          <w:bottom w:space="0" w:sz="0" w:val="nil"/>
+          <w:right w:space="0" w:sz="0" w:val="nil"/>
+          <w:between w:space="0" w:sz="0" w:val="nil"/>
+        </w:pBdr>
+        <w:shd w:fill="auto" w:val="clear"/>
+        <w:spacing w:after="0" w:before="0" w:line="240" w:lineRule="auto"/>
+        <w:ind w:left="0" w:right="0" w:firstLine="0"/>
+        <w:jc w:val="left"/>
+        <w:rPr>
+          <w:rFonts w:ascii="Arial" w:cs="Arial" w:eastAsia="Arial" w:hAnsi="Arial"/>
+          <w:b w:val="0"/>
+          <w:i w:val="0"/>
+          <w:smallCaps w:val="0"/>
+          <w:strike w:val="0"/>
+          <w:color w:val="000000"/>
+          <w:sz w:val="22"/>
+          <w:szCs w:val="22"/>
+          <w:u w:val="none"/>
+          <w:shd w:fill="auto" w:val="clear"/>
+          <w:vertAlign w:val="baseline"/>
+        </w:rPr>
+      </w:pPr>
+      <w:r>
+        <w:rPr>
+          <w:rtl w:val="0"/>
+        </w:rPr>
+      </w:r>
+    </w:p>
+    <w:p>
+      <w:pPr>
+        <w:keepNext w:val="0"/>
+        <w:keepLines w:val="0"/>
+        <w:pageBreakBefore w:val="0"/>
+        <w:widowControl w:val="0"/>
+        <w:pBdr>
+          <w:top w:space="0" w:sz="0" w:val="nil"/>
+          <w:left w:space="0" w:sz="0" w:val="nil"/>
+          <w:bottom w:space="0" w:sz="0" w:val="nil"/>
+          <w:right w:space="0" w:sz="0" w:val="nil"/>
+          <w:between w:space="0" w:sz="0" w:val="nil"/>
+        </w:pBdr>
+        <w:shd w:fill="auto" w:val="clear"/>
+        <w:spacing w:after="0" w:before="0" w:line="240" w:lineRule="auto"/>
+        <w:ind w:left="0" w:right="0" w:firstLine="0"/>
+        <w:jc w:val="left"/>
+        <w:rPr>
+          <w:rFonts w:ascii="Arial" w:cs="Arial" w:eastAsia="Arial" w:hAnsi="Arial"/>
+          <w:b w:val="0"/>
+          <w:i w:val="0"/>
+          <w:smallCaps w:val="0"/>
+          <w:strike w:val="0"/>
+          <w:color w:val="000000"/>
+          <w:sz w:val="22"/>
+          <w:szCs w:val="22"/>
+          <w:u w:val="none"/>
+          <w:shd w:fill="auto" w:val="clear"/>
+          <w:vertAlign w:val="baseline"/>
+        </w:rPr>
+      </w:pPr>
+      <w:r>
+        <w:rPr>
+          <w:rFonts w:ascii="Arial" w:cs="Arial" w:eastAsia="Arial" w:hAnsi="Arial"/>
+          <w:b w:val="0"/>
+          <w:i w:val="0"/>
+          <w:smallCaps w:val="0"/>
+          <w:strike w:val="0"/>
+          <w:color w:val="000000"/>
+          <w:sz w:val="22"/>
+          <w:szCs w:val="22"/>
+          <w:u w:val="none"/>
+          <w:shd w:fill="auto" w:val="clear"/>
+          <w:vertAlign w:val="baseline"/>
+          <w:rtl w:val="0"/>
+        </w:rPr>
+        <w:t xml:space="preserve">"We also don’t require you to host this platform online, but your code should contain stubs where the server communication logic will reside."</w:t>
+      </w:r>
+    </w:p>
+    <w:p>
+      <w:pPr>
+        <w:keepNext w:val="0"/>
+        <w:keepLines w:val="0"/>
+        <w:pageBreakBefore w:val="0"/>
+        <w:widowControl w:val="0"/>
+        <w:pBdr>
+          <w:top w:space="0" w:sz="0" w:val="nil"/>
+          <w:left w:space="0" w:sz="0" w:val="nil"/>
+          <w:bottom w:space="0" w:sz="0" w:val="nil"/>
+          <w:right w:space="0" w:sz="0" w:val="nil"/>
+          <w:between w:space="0" w:sz="0" w:val="nil"/>
+        </w:pBdr>
+        <w:shd w:fill="auto" w:val="clear"/>
+        <w:spacing w:after="0" w:before="0" w:line="240" w:lineRule="auto"/>
+        <w:ind w:left="0" w:right="0" w:firstLine="0"/>
+        <w:jc w:val="left"/>
+        <w:rPr>
+          <w:rFonts w:ascii="Arial" w:cs="Arial" w:eastAsia="Arial" w:hAnsi="Arial"/>
+          <w:b w:val="0"/>
+          <w:i w:val="0"/>
+          <w:smallCaps w:val="0"/>
+          <w:strike w:val="0"/>
+          <w:color w:val="000000"/>
+          <w:sz w:val="22"/>
+          <w:szCs w:val="22"/>
+          <w:u w:val="none"/>
+          <w:shd w:fill="auto" w:val="clear"/>
+          <w:vertAlign w:val="baseline"/>
+        </w:rPr>
+      </w:pPr>
+      <w:r>
+        <w:rPr>
+          <w:rtl w:val="0"/>
+        </w:rPr>
+      </w:r>
+    </w:p>
+    <w:p>
+      <w:pPr>
+        <w:keepNext w:val="0"/>
+        <w:keepLines w:val="0"/>
+        <w:pageBreakBefore w:val="0"/>
+        <w:widowControl w:val="0"/>
+        <w:pBdr>
+          <w:top w:space="0" w:sz="0" w:val="nil"/>
+          <w:left w:space="0" w:sz="0" w:val="nil"/>
+          <w:bottom w:space="0" w:sz="0" w:val="nil"/>
+          <w:right w:space="0" w:sz="0" w:val="nil"/>
+          <w:between w:space="0" w:sz="0" w:val="nil"/>
+        </w:pBdr>
+        <w:shd w:fill="auto" w:val="clear"/>
+        <w:spacing w:after="0" w:before="0" w:line="240" w:lineRule="auto"/>
+        <w:ind w:left="0" w:right="0" w:firstLine="0"/>
+        <w:jc w:val="left"/>
+        <w:rPr>
+          <w:rFonts w:ascii="Arial" w:cs="Arial" w:eastAsia="Arial" w:hAnsi="Arial"/>
+          <w:b w:val="0"/>
+          <w:i w:val="0"/>
+          <w:smallCaps w:val="0"/>
+          <w:strike w:val="0"/>
+          <w:color w:val="000000"/>
+          <w:sz w:val="22"/>
+          <w:szCs w:val="22"/>
+          <w:u w:val="none"/>
+          <w:shd w:fill="auto" w:val="clear"/>
+          <w:vertAlign w:val="baseline"/>
+        </w:rPr>
+      </w:pPr>
+      <w:r>
+        <w:rPr>
+          <w:rFonts w:ascii="Arial" w:cs="Arial" w:eastAsia="Arial" w:hAnsi="Arial"/>
+          <w:b w:val="0"/>
+          <w:i w:val="0"/>
+          <w:smallCaps w:val="0"/>
+          <w:strike w:val="0"/>
+          <w:color w:val="000000"/>
+          <w:sz w:val="22"/>
+          <w:szCs w:val="22"/>
+          <w:u w:val="none"/>
+          <w:shd w:fill="auto" w:val="clear"/>
+          <w:vertAlign w:val="baseline"/>
+          <w:rtl w:val="0"/>
+        </w:rPr>
+        <w:t xml:space="preserve">Not only is the team implying that they will not use stubs, but they are also going above and beyond by creating their own server. This goes against the wishes of the CEO. It is critical that the team listens to and respects the CEO's instructions. As a client, behavior like this from my team would be unacceptable. Remember, the CEO has a "dedicated database team." Why are these functions being implemented?</w:t>
       </w:r>
     </w:p>
   </w:comment>

</xml_diff>

<commit_message>
more changes to annotations Sam E
</commit_message>
<xml_diff>
--- a/Iteration_2/Echo_Networking/Networking_Outline.docx
+++ b/Iteration_2/Echo_Networking/Networking_Outline.docx
@@ -109,6 +109,7 @@
           <w:vertAlign w:val="baseline"/>
         </w:rPr>
       </w:pPr>
+      <w:commentRangeStart w:id="1"/>
       <w:r>
         <w:rPr>
           <w:rFonts w:ascii="Noto Sans Symbols" w:cs="Noto Sans Symbols" w:eastAsia="Noto Sans Symbols" w:hAnsi="Noto Sans Symbols"/>
@@ -487,8 +488,12 @@
         </w:rPr>
         <w:t xml:space="preserve">clients </w:t>
       </w:r>
-      <w:commentRangeStart w:id="1"/>
+      <w:commentRangeEnd w:id="1"/>
+      <w:r>
+        <w:commentReference w:id="1"/>
+      </w:r>
       <w:commentRangeStart w:id="2"/>
+      <w:commentRangeStart w:id="3"/>
       <w:r>
         <w:rPr>
           <w:rtl w:val="0"/>
@@ -526,13 +531,13 @@
           <w:vertAlign w:val="baseline"/>
         </w:rPr>
       </w:pPr>
-      <w:commentRangeEnd w:id="1"/>
-      <w:r>
-        <w:commentReference w:id="1"/>
-      </w:r>
       <w:commentRangeEnd w:id="2"/>
       <w:r>
         <w:commentReference w:id="2"/>
+      </w:r>
+      <w:commentRangeEnd w:id="3"/>
+      <w:r>
+        <w:commentReference w:id="3"/>
       </w:r>
       <w:r>
         <w:rPr>
@@ -583,7 +588,7 @@
           <w:vertAlign w:val="baseline"/>
         </w:rPr>
       </w:pPr>
-      <w:commentRangeStart w:id="3"/>
+      <w:commentRangeStart w:id="4"/>
       <w:r>
         <w:rPr>
           <w:rFonts w:ascii="Arial" w:cs="Arial" w:eastAsia="Arial" w:hAnsi="Arial"/>
@@ -601,9 +606,9 @@
         </w:rPr>
         <w:t xml:space="preserve">The first two are mostly covered by the Authentication &amp; Profile Team as well as the  Leaderboard &amp; Matchmaking Team, so we simply will need to utilize the functions they end up making and sending the data they prepare over our connection</w:t>
       </w:r>
-      <w:commentRangeEnd w:id="3"/>
-      <w:r>
-        <w:commentReference w:id="3"/>
+      <w:commentRangeEnd w:id="4"/>
+      <w:r>
+        <w:commentReference w:id="4"/>
       </w:r>
       <w:r>
         <w:rPr>
@@ -650,7 +655,7 @@
           <w:vertAlign w:val="baseline"/>
         </w:rPr>
       </w:pPr>
-      <w:commentRangeStart w:id="4"/>
+      <w:commentRangeStart w:id="5"/>
       <w:r>
         <w:rPr>
           <w:rFonts w:ascii="Arial" w:cs="Arial" w:eastAsia="Arial" w:hAnsi="Arial"/>
@@ -777,9 +782,9 @@
         <w:t xml:space="preserve"> clients-side loop after it collects the servers response</w:t>
       </w:r>
       <w:ins w:author="Hannah Xia" w:id="4" w:date="2024-11-13T20:24:26Z">
-        <w:commentRangeEnd w:id="4"/>
+        <w:commentRangeEnd w:id="5"/>
         <w:r>
-          <w:commentReference w:id="4"/>
+          <w:commentReference w:id="5"/>
         </w:r>
         <w:r>
           <w:rPr>
@@ -1025,7 +1030,7 @@
           <w:vertAlign w:val="baseline"/>
         </w:rPr>
       </w:pPr>
-      <w:commentRangeStart w:id="5"/>
+      <w:commentRangeStart w:id="6"/>
       <w:r>
         <w:rPr>
           <w:rFonts w:ascii="Arial" w:cs="Arial" w:eastAsia="Arial" w:hAnsi="Arial"/>
@@ -1068,9 +1073,9 @@
         </w:rPr>
         <w:t xml:space="preserve">the leaderboard code</w:t>
       </w:r>
-      <w:commentRangeEnd w:id="5"/>
-      <w:r>
-        <w:commentReference w:id="5"/>
+      <w:commentRangeEnd w:id="6"/>
+      <w:r>
+        <w:commentReference w:id="6"/>
       </w:r>
       <w:r>
         <w:rPr>
@@ -1421,7 +1426,7 @@
         </w:rPr>
         <w:t xml:space="preserve"> message and calling one our SendMessage(</w:t>
       </w:r>
-      <w:commentRangeStart w:id="6"/>
+      <w:commentRangeStart w:id="7"/>
       <w:r>
         <w:rPr>
           <w:rFonts w:ascii="Arial" w:cs="Arial" w:eastAsia="Arial" w:hAnsi="Arial"/>
@@ -1439,9 +1444,9 @@
         </w:rPr>
         <w:t xml:space="preserve">Message  msg)</w:t>
       </w:r>
-      <w:commentRangeEnd w:id="6"/>
-      <w:r>
-        <w:commentReference w:id="6"/>
+      <w:commentRangeEnd w:id="7"/>
+      <w:r>
+        <w:commentReference w:id="7"/>
       </w:r>
       <w:r>
         <w:rPr>
@@ -1688,7 +1693,8 @@
           <w:vertAlign w:val="baseline"/>
         </w:rPr>
       </w:pPr>
-      <w:commentRangeStart w:id="7"/>
+      <w:commentRangeStart w:id="8"/>
+      <w:commentRangeStart w:id="9"/>
       <w:r>
         <w:rPr>
           <w:rFonts w:ascii="Arial" w:cs="Arial" w:eastAsia="Arial" w:hAnsi="Arial"/>
@@ -1755,9 +1761,13 @@
         </w:rPr>
         <w:t xml:space="preserve">As well as a sister function SetUsersTurn() that sets lets the user know it their turn (bad way  of explaining it, but I can’t think of any other way at the moment) </w:t>
       </w:r>
-      <w:commentRangeEnd w:id="7"/>
-      <w:r>
-        <w:commentReference w:id="7"/>
+      <w:commentRangeEnd w:id="8"/>
+      <w:r>
+        <w:commentReference w:id="8"/>
+      </w:r>
+      <w:commentRangeEnd w:id="9"/>
+      <w:r>
+        <w:commentReference w:id="9"/>
       </w:r>
       <w:r>
         <w:rPr>
@@ -1894,7 +1904,11 @@
           <w:vertAlign w:val="baseline"/>
         </w:rPr>
       </w:pPr>
-      <w:commentRangeStart w:id="8"/>
+      <w:commentRangeStart w:id="10"/>
+      <w:commentRangeStart w:id="11"/>
+      <w:commentRangeStart w:id="12"/>
+      <w:commentRangeStart w:id="13"/>
+      <w:commentRangeStart w:id="14"/>
       <w:r>
         <w:rPr>
           <w:rFonts w:ascii="Arial" w:cs="Arial" w:eastAsia="Arial" w:hAnsi="Arial"/>
@@ -1912,9 +1926,25 @@
         </w:rPr>
         <w:t xml:space="preserve">The main networking loop must</w:t>
       </w:r>
-      <w:commentRangeEnd w:id="8"/>
-      <w:r>
-        <w:commentReference w:id="8"/>
+      <w:commentRangeEnd w:id="10"/>
+      <w:r>
+        <w:commentReference w:id="10"/>
+      </w:r>
+      <w:commentRangeEnd w:id="11"/>
+      <w:r>
+        <w:commentReference w:id="11"/>
+      </w:r>
+      <w:commentRangeEnd w:id="12"/>
+      <w:r>
+        <w:commentReference w:id="12"/>
+      </w:r>
+      <w:commentRangeEnd w:id="13"/>
+      <w:r>
+        <w:commentReference w:id="13"/>
+      </w:r>
+      <w:commentRangeEnd w:id="14"/>
+      <w:r>
+        <w:commentReference w:id="14"/>
       </w:r>
       <w:r>
         <w:rPr>
@@ -2425,7 +2455,7 @@
           <w:vertAlign w:val="baseline"/>
         </w:rPr>
       </w:pPr>
-      <w:commentRangeStart w:id="9"/>
+      <w:commentRangeStart w:id="15"/>
       <w:r>
         <w:rPr>
           <w:rFonts w:ascii="Arial" w:cs="Arial" w:eastAsia="Arial" w:hAnsi="Arial"/>
@@ -2443,9 +2473,9 @@
         </w:rPr>
         <w:t xml:space="preserve">Feel free to recommend another method of sending our data on the network</w:t>
       </w:r>
-      <w:commentRangeEnd w:id="9"/>
-      <w:r>
-        <w:commentReference w:id="9"/>
+      <w:commentRangeEnd w:id="15"/>
+      <w:r>
+        <w:commentReference w:id="15"/>
       </w:r>
       <w:r>
         <w:rPr>
@@ -2911,8 +2941,8 @@
           <w:vertAlign w:val="baseline"/>
         </w:rPr>
       </w:pPr>
-      <w:commentRangeStart w:id="10"/>
-      <w:commentRangeStart w:id="11"/>
+      <w:commentRangeStart w:id="16"/>
+      <w:commentRangeStart w:id="17"/>
       <w:r>
         <w:rPr>
           <w:rFonts w:ascii="Arial" w:cs="Arial" w:eastAsia="Arial" w:hAnsi="Arial"/>
@@ -2930,13 +2960,13 @@
         </w:rPr>
         <w:t xml:space="preserve">And our last option that I can think of right now is we could look for a library that has a  simplified networking protocol and use that </w:t>
       </w:r>
-      <w:commentRangeEnd w:id="10"/>
-      <w:r>
-        <w:commentReference w:id="10"/>
-      </w:r>
-      <w:commentRangeEnd w:id="11"/>
-      <w:r>
-        <w:commentReference w:id="11"/>
+      <w:commentRangeEnd w:id="16"/>
+      <w:r>
+        <w:commentReference w:id="16"/>
+      </w:r>
+      <w:commentRangeEnd w:id="17"/>
+      <w:r>
+        <w:commentReference w:id="17"/>
       </w:r>
       <w:r>
         <w:rPr>
@@ -2975,7 +3005,8 @@
           <w:vertAlign w:val="baseline"/>
         </w:rPr>
       </w:pPr>
-      <w:commentRangeStart w:id="12"/>
+      <w:commentRangeStart w:id="18"/>
+      <w:commentRangeStart w:id="19"/>
       <w:r>
         <w:rPr>
           <w:rFonts w:ascii="Arial" w:cs="Arial" w:eastAsia="Arial" w:hAnsi="Arial"/>
@@ -2993,9 +3024,13 @@
         </w:rPr>
         <w:t xml:space="preserve">The Server-Side Loop </w:t>
       </w:r>
-      <w:commentRangeEnd w:id="12"/>
-      <w:r>
-        <w:commentReference w:id="12"/>
+      <w:commentRangeEnd w:id="18"/>
+      <w:r>
+        <w:commentReference w:id="18"/>
+      </w:r>
+      <w:commentRangeEnd w:id="19"/>
+      <w:r>
+        <w:commentReference w:id="19"/>
       </w:r>
       <w:r>
         <w:rPr>
@@ -3034,7 +3069,7 @@
           <w:vertAlign w:val="baseline"/>
         </w:rPr>
       </w:pPr>
-      <w:commentRangeStart w:id="13"/>
+      <w:commentRangeStart w:id="20"/>
       <w:r>
         <w:rPr>
           <w:rFonts w:ascii="Arial" w:cs="Arial" w:eastAsia="Arial" w:hAnsi="Arial"/>
@@ -3052,9 +3087,9 @@
         </w:rPr>
         <w:t xml:space="preserve">The server-side loop is not our top priority, but I do think we can get it done within the time  frame, It will consist of 3 loops all running on different threads at the same time </w:t>
       </w:r>
-      <w:commentRangeEnd w:id="13"/>
-      <w:r>
-        <w:commentReference w:id="13"/>
+      <w:commentRangeEnd w:id="20"/>
+      <w:r>
+        <w:commentReference w:id="20"/>
       </w:r>
       <w:r>
         <w:rPr>
@@ -3363,7 +3398,7 @@
 
 <file path=word/comments.xml><?xml version="1.0" encoding="utf-8"?>
 <w:comments xmlns:mc="http://schemas.openxmlformats.org/markup-compatibility/2006" xmlns:o="urn:schemas-microsoft-com:office:office" xmlns:r="http://schemas.openxmlformats.org/officeDocument/2006/relationships" xmlns:m="http://schemas.openxmlformats.org/officeDocument/2006/math" xmlns:v="urn:schemas-microsoft-com:vml" xmlns:wp="http://schemas.openxmlformats.org/drawingml/2006/wordprocessingDrawing" xmlns:w10="urn:schemas-microsoft-com:office:word" xmlns:w="http://schemas.openxmlformats.org/wordprocessingml/2006/main" xmlns:wne="http://schemas.microsoft.com/office/word/2006/wordml" xmlns:sl="http://schemas.openxmlformats.org/schemaLibrary/2006/main" xmlns:a="http://schemas.openxmlformats.org/drawingml/2006/main" xmlns:pic="http://schemas.openxmlformats.org/drawingml/2006/picture" xmlns:c="http://schemas.openxmlformats.org/drawingml/2006/chart" xmlns:lc="http://schemas.openxmlformats.org/drawingml/2006/lockedCanvas" xmlns:dgm="http://schemas.openxmlformats.org/drawingml/2006/diagram" xmlns:wps="http://schemas.microsoft.com/office/word/2010/wordprocessingShape" xmlns:wpg="http://schemas.microsoft.com/office/word/2010/wordprocessingGroup" xmlns:w14="http://schemas.microsoft.com/office/word/2010/wordml" xmlns:w15="http://schemas.microsoft.com/office/word/2012/wordml" xmlns:w16="http://schemas.microsoft.com/office/word/2018/wordml" xmlns:w16cex="http://schemas.microsoft.com/office/word/2018/wordml/cex" xmlns:w16cid="http://schemas.microsoft.com/office/word/2016/wordml/cid" xmlns="http://schemas.microsoft.com/office/tasks/2019/documenttasks" xmlns:cr="http://schemas.microsoft.com/office/comments/2020/reactions">
-  <w:comment w:author="Hannah Xia" w:id="9" w:date="2024-11-11T04:04:37Z">
+  <w:comment w:author="Hannah Xia" w:id="15" w:date="2024-11-11T04:04:37Z">
     <w:p>
       <w:pPr>
         <w:keepNext w:val="0"/>
@@ -3414,7 +3449,7 @@
       </w:r>
     </w:p>
   </w:comment>
-  <w:comment w:author="Samuel Ergando" w:id="4" w:date="2024-11-14T01:18:49Z">
+  <w:comment w:author="Samuel Ergando" w:id="5" w:date="2024-11-14T01:18:49Z">
     <w:p>
       <w:pPr>
         <w:keepNext w:val="0"/>
@@ -3514,7 +3549,7 @@
       </w:r>
     </w:p>
   </w:comment>
-  <w:comment w:author="Hannah Xia" w:id="8" w:date="2024-11-13T20:16:49Z">
+  <w:comment w:author="Hannah Xia" w:id="10" w:date="2024-11-13T20:16:49Z">
     <w:p>
       <w:pPr>
         <w:keepNext w:val="0"/>
@@ -3561,7 +3596,7 @@
           <w:vertAlign w:val="baseline"/>
           <w:rtl w:val="0"/>
         </w:rPr>
-        <w:t xml:space="preserve">Using a "main loop" for all of networking function isn't the best way to do this because it's hard to maintain, not to mention the loop as to be run anytime you need to access the database (bad running time).</w:t>
+        <w:t xml:space="preserve">Using a "main loop" for all of networking function isn't the best way to do this because it's hard to maintain, not to mention the loop has to be run anytime you need to access the database (bad running time).</w:t>
       </w:r>
     </w:p>
     <w:p>
@@ -3774,7 +3809,7 @@
       </w:r>
     </w:p>
   </w:comment>
-  <w:comment w:author="Hannah Xia" w:id="1" w:date="2024-11-11T03:49:26Z">
+  <w:comment w:author="Hannah Xia" w:id="11" w:date="2024-11-14T01:29:05Z">
     <w:p>
       <w:pPr>
         <w:keepNext w:val="0"/>
@@ -3821,11 +3856,11 @@
           <w:vertAlign w:val="baseline"/>
           <w:rtl w:val="0"/>
         </w:rPr>
-        <w:t xml:space="preserve">Consider including matchmaking as a major aspect in networking. Preferably, have a class dedicated to handle how you would want to match players instead of loops...</w:t>
+        <w:t xml:space="preserve">_Marked as resolved_</w:t>
       </w:r>
     </w:p>
   </w:comment>
-  <w:comment w:author="Morteza Faraji" w:id="2" w:date="2024-11-14T01:04:19Z">
+  <w:comment w:author="Hannah Xia" w:id="12" w:date="2024-11-14T01:29:06Z">
     <w:p>
       <w:pPr>
         <w:keepNext w:val="0"/>
@@ -3872,11 +3907,11 @@
           <w:vertAlign w:val="baseline"/>
           <w:rtl w:val="0"/>
         </w:rPr>
-        <w:t xml:space="preserve">This comment may not be fully accurate. I think they have a leaderboard and matchmaking. So They may have a dedicated class</w:t>
+        <w:t xml:space="preserve">_Re-opened_</w:t>
       </w:r>
     </w:p>
   </w:comment>
-  <w:comment w:author="Hannah Xia" w:id="7" w:date="2024-11-11T03:46:50Z">
+  <w:comment w:author="Hannah Xia" w:id="13" w:date="2024-11-14T01:29:24Z">
     <w:p>
       <w:pPr>
         <w:keepNext w:val="0"/>
@@ -3923,9 +3958,11 @@
           <w:vertAlign w:val="baseline"/>
           <w:rtl w:val="0"/>
         </w:rPr>
-        <w:t xml:space="preserve">This is good but consider a termination method that checks if the conditions for termination has been met. It should be included here because it should be checked every time after a user has made a move.</w:t>
-      </w:r>
-    </w:p>
+        <w:t xml:space="preserve">_Marked as resolved_</w:t>
+      </w:r>
+    </w:p>
+  </w:comment>
+  <w:comment w:author="Hannah Xia" w:id="14" w:date="2024-11-14T01:29:26Z">
     <w:p>
       <w:pPr>
         <w:keepNext w:val="0"/>
@@ -3959,10 +3996,24 @@
       </w:pPr>
       <w:r>
         <w:rPr>
-          <w:rtl w:val="0"/>
-        </w:rPr>
-      </w:r>
-    </w:p>
+          <w:rFonts w:ascii="Arial" w:cs="Arial" w:eastAsia="Arial" w:hAnsi="Arial"/>
+          <w:b w:val="0"/>
+          <w:i w:val="0"/>
+          <w:smallCaps w:val="0"/>
+          <w:strike w:val="0"/>
+          <w:color w:val="000000"/>
+          <w:sz w:val="22"/>
+          <w:szCs w:val="22"/>
+          <w:u w:val="none"/>
+          <w:shd w:fill="auto" w:val="clear"/>
+          <w:vertAlign w:val="baseline"/>
+          <w:rtl w:val="0"/>
+        </w:rPr>
+        <w:t xml:space="preserve">_Re-opened_</w:t>
+      </w:r>
+    </w:p>
+  </w:comment>
+  <w:comment w:author="Hannah Xia" w:id="2" w:date="2024-11-11T03:49:26Z">
     <w:p>
       <w:pPr>
         <w:keepNext w:val="0"/>
@@ -4009,7 +4060,246 @@
           <w:vertAlign w:val="baseline"/>
           <w:rtl w:val="0"/>
         </w:rPr>
+        <w:t xml:space="preserve">Consider including matchmaking as a major aspect in networking. Preferably, have a class dedicated to handle how you would want to match players instead of loops...</w:t>
+      </w:r>
+    </w:p>
+  </w:comment>
+  <w:comment w:author="Morteza Faraji" w:id="3" w:date="2024-11-14T01:04:19Z">
+    <w:p>
+      <w:pPr>
+        <w:keepNext w:val="0"/>
+        <w:keepLines w:val="0"/>
+        <w:pageBreakBefore w:val="0"/>
+        <w:widowControl w:val="0"/>
+        <w:pBdr>
+          <w:top w:space="0" w:sz="0" w:val="nil"/>
+          <w:left w:space="0" w:sz="0" w:val="nil"/>
+          <w:bottom w:space="0" w:sz="0" w:val="nil"/>
+          <w:right w:space="0" w:sz="0" w:val="nil"/>
+          <w:between w:space="0" w:sz="0" w:val="nil"/>
+        </w:pBdr>
+        <w:shd w:fill="auto" w:val="clear"/>
+        <w:spacing w:after="0" w:before="0" w:line="240" w:lineRule="auto"/>
+        <w:ind w:left="0" w:right="0" w:firstLine="0"/>
+        <w:jc w:val="left"/>
+        <w:rPr>
+          <w:rFonts w:ascii="Arial" w:cs="Arial" w:eastAsia="Arial" w:hAnsi="Arial"/>
+          <w:b w:val="0"/>
+          <w:i w:val="0"/>
+          <w:smallCaps w:val="0"/>
+          <w:strike w:val="0"/>
+          <w:color w:val="000000"/>
+          <w:sz w:val="22"/>
+          <w:szCs w:val="22"/>
+          <w:u w:val="none"/>
+          <w:shd w:fill="auto" w:val="clear"/>
+          <w:vertAlign w:val="baseline"/>
+        </w:rPr>
+      </w:pPr>
+      <w:r>
+        <w:rPr>
+          <w:rFonts w:ascii="Arial" w:cs="Arial" w:eastAsia="Arial" w:hAnsi="Arial"/>
+          <w:b w:val="0"/>
+          <w:i w:val="0"/>
+          <w:smallCaps w:val="0"/>
+          <w:strike w:val="0"/>
+          <w:color w:val="000000"/>
+          <w:sz w:val="22"/>
+          <w:szCs w:val="22"/>
+          <w:u w:val="none"/>
+          <w:shd w:fill="auto" w:val="clear"/>
+          <w:vertAlign w:val="baseline"/>
+          <w:rtl w:val="0"/>
+        </w:rPr>
+        <w:t xml:space="preserve">This comment may not be fully accurate. I think they have a leaderboard and matchmaking. So They may have a dedicated class</w:t>
+      </w:r>
+    </w:p>
+  </w:comment>
+  <w:comment w:author="Hannah Xia" w:id="9" w:date="2024-11-11T03:46:50Z">
+    <w:p>
+      <w:pPr>
+        <w:keepNext w:val="0"/>
+        <w:keepLines w:val="0"/>
+        <w:pageBreakBefore w:val="0"/>
+        <w:widowControl w:val="0"/>
+        <w:pBdr>
+          <w:top w:space="0" w:sz="0" w:val="nil"/>
+          <w:left w:space="0" w:sz="0" w:val="nil"/>
+          <w:bottom w:space="0" w:sz="0" w:val="nil"/>
+          <w:right w:space="0" w:sz="0" w:val="nil"/>
+          <w:between w:space="0" w:sz="0" w:val="nil"/>
+        </w:pBdr>
+        <w:shd w:fill="auto" w:val="clear"/>
+        <w:spacing w:after="0" w:before="0" w:line="240" w:lineRule="auto"/>
+        <w:ind w:left="0" w:right="0" w:firstLine="0"/>
+        <w:jc w:val="left"/>
+        <w:rPr>
+          <w:rFonts w:ascii="Arial" w:cs="Arial" w:eastAsia="Arial" w:hAnsi="Arial"/>
+          <w:b w:val="0"/>
+          <w:i w:val="0"/>
+          <w:smallCaps w:val="0"/>
+          <w:strike w:val="0"/>
+          <w:color w:val="000000"/>
+          <w:sz w:val="22"/>
+          <w:szCs w:val="22"/>
+          <w:u w:val="none"/>
+          <w:shd w:fill="auto" w:val="clear"/>
+          <w:vertAlign w:val="baseline"/>
+        </w:rPr>
+      </w:pPr>
+      <w:r>
+        <w:rPr>
+          <w:rFonts w:ascii="Arial" w:cs="Arial" w:eastAsia="Arial" w:hAnsi="Arial"/>
+          <w:b w:val="0"/>
+          <w:i w:val="0"/>
+          <w:smallCaps w:val="0"/>
+          <w:strike w:val="0"/>
+          <w:color w:val="000000"/>
+          <w:sz w:val="22"/>
+          <w:szCs w:val="22"/>
+          <w:u w:val="none"/>
+          <w:shd w:fill="auto" w:val="clear"/>
+          <w:vertAlign w:val="baseline"/>
+          <w:rtl w:val="0"/>
+        </w:rPr>
+        <w:t xml:space="preserve">This is good but consider a termination method that checks if the conditions for termination has been met. It should be included here because it should be checked every time after a user has made a move.</w:t>
+      </w:r>
+    </w:p>
+    <w:p>
+      <w:pPr>
+        <w:keepNext w:val="0"/>
+        <w:keepLines w:val="0"/>
+        <w:pageBreakBefore w:val="0"/>
+        <w:widowControl w:val="0"/>
+        <w:pBdr>
+          <w:top w:space="0" w:sz="0" w:val="nil"/>
+          <w:left w:space="0" w:sz="0" w:val="nil"/>
+          <w:bottom w:space="0" w:sz="0" w:val="nil"/>
+          <w:right w:space="0" w:sz="0" w:val="nil"/>
+          <w:between w:space="0" w:sz="0" w:val="nil"/>
+        </w:pBdr>
+        <w:shd w:fill="auto" w:val="clear"/>
+        <w:spacing w:after="0" w:before="0" w:line="240" w:lineRule="auto"/>
+        <w:ind w:left="0" w:right="0" w:firstLine="0"/>
+        <w:jc w:val="left"/>
+        <w:rPr>
+          <w:rFonts w:ascii="Arial" w:cs="Arial" w:eastAsia="Arial" w:hAnsi="Arial"/>
+          <w:b w:val="0"/>
+          <w:i w:val="0"/>
+          <w:smallCaps w:val="0"/>
+          <w:strike w:val="0"/>
+          <w:color w:val="000000"/>
+          <w:sz w:val="22"/>
+          <w:szCs w:val="22"/>
+          <w:u w:val="none"/>
+          <w:shd w:fill="auto" w:val="clear"/>
+          <w:vertAlign w:val="baseline"/>
+        </w:rPr>
+      </w:pPr>
+      <w:r>
+        <w:rPr>
+          <w:rtl w:val="0"/>
+        </w:rPr>
+      </w:r>
+    </w:p>
+    <w:p>
+      <w:pPr>
+        <w:keepNext w:val="0"/>
+        <w:keepLines w:val="0"/>
+        <w:pageBreakBefore w:val="0"/>
+        <w:widowControl w:val="0"/>
+        <w:pBdr>
+          <w:top w:space="0" w:sz="0" w:val="nil"/>
+          <w:left w:space="0" w:sz="0" w:val="nil"/>
+          <w:bottom w:space="0" w:sz="0" w:val="nil"/>
+          <w:right w:space="0" w:sz="0" w:val="nil"/>
+          <w:between w:space="0" w:sz="0" w:val="nil"/>
+        </w:pBdr>
+        <w:shd w:fill="auto" w:val="clear"/>
+        <w:spacing w:after="0" w:before="0" w:line="240" w:lineRule="auto"/>
+        <w:ind w:left="0" w:right="0" w:firstLine="0"/>
+        <w:jc w:val="left"/>
+        <w:rPr>
+          <w:rFonts w:ascii="Arial" w:cs="Arial" w:eastAsia="Arial" w:hAnsi="Arial"/>
+          <w:b w:val="0"/>
+          <w:i w:val="0"/>
+          <w:smallCaps w:val="0"/>
+          <w:strike w:val="0"/>
+          <w:color w:val="000000"/>
+          <w:sz w:val="22"/>
+          <w:szCs w:val="22"/>
+          <w:u w:val="none"/>
+          <w:shd w:fill="auto" w:val="clear"/>
+          <w:vertAlign w:val="baseline"/>
+        </w:rPr>
+      </w:pPr>
+      <w:r>
+        <w:rPr>
+          <w:rFonts w:ascii="Arial" w:cs="Arial" w:eastAsia="Arial" w:hAnsi="Arial"/>
+          <w:b w:val="0"/>
+          <w:i w:val="0"/>
+          <w:smallCaps w:val="0"/>
+          <w:strike w:val="0"/>
+          <w:color w:val="000000"/>
+          <w:sz w:val="22"/>
+          <w:szCs w:val="22"/>
+          <w:u w:val="none"/>
+          <w:shd w:fill="auto" w:val="clear"/>
+          <w:vertAlign w:val="baseline"/>
+          <w:rtl w:val="0"/>
+        </w:rPr>
         <w:t xml:space="preserve">For example, in a game like tictactoe, if there is a row of 3 x's o's, or the game is cat, the game will terminate.</w:t>
+      </w:r>
+    </w:p>
+  </w:comment>
+  <w:comment w:author="Samuel Ergando" w:id="1" w:date="2024-11-14T01:35:00Z">
+    <w:p>
+      <w:pPr>
+        <w:keepNext w:val="0"/>
+        <w:keepLines w:val="0"/>
+        <w:pageBreakBefore w:val="0"/>
+        <w:widowControl w:val="0"/>
+        <w:pBdr>
+          <w:top w:space="0" w:sz="0" w:val="nil"/>
+          <w:left w:space="0" w:sz="0" w:val="nil"/>
+          <w:bottom w:space="0" w:sz="0" w:val="nil"/>
+          <w:right w:space="0" w:sz="0" w:val="nil"/>
+          <w:between w:space="0" w:sz="0" w:val="nil"/>
+        </w:pBdr>
+        <w:shd w:fill="auto" w:val="clear"/>
+        <w:spacing w:after="0" w:before="0" w:line="240" w:lineRule="auto"/>
+        <w:ind w:left="0" w:right="0" w:firstLine="0"/>
+        <w:jc w:val="left"/>
+        <w:rPr>
+          <w:rFonts w:ascii="Arial" w:cs="Arial" w:eastAsia="Arial" w:hAnsi="Arial"/>
+          <w:b w:val="0"/>
+          <w:i w:val="0"/>
+          <w:smallCaps w:val="0"/>
+          <w:strike w:val="0"/>
+          <w:color w:val="000000"/>
+          <w:sz w:val="22"/>
+          <w:szCs w:val="22"/>
+          <w:u w:val="none"/>
+          <w:shd w:fill="auto" w:val="clear"/>
+          <w:vertAlign w:val="baseline"/>
+        </w:rPr>
+      </w:pPr>
+      <w:r>
+        <w:rPr>
+          <w:rFonts w:ascii="Arial" w:cs="Arial" w:eastAsia="Arial" w:hAnsi="Arial"/>
+          <w:b w:val="0"/>
+          <w:i w:val="0"/>
+          <w:smallCaps w:val="0"/>
+          <w:strike w:val="0"/>
+          <w:color w:val="000000"/>
+          <w:sz w:val="22"/>
+          <w:szCs w:val="22"/>
+          <w:u w:val="none"/>
+          <w:shd w:fill="auto" w:val="clear"/>
+          <w:vertAlign w:val="baseline"/>
+          <w:rtl w:val="0"/>
+        </w:rPr>
+        <w:t xml:space="preserve">The first four points are generally positive and assuming the team knows  alot more then SENG requires (computer networking) then it's probably achievable. The last point made about a dedicated server is problematic and far to ambitious let alone undergrad, probably even an enterprise level application.</w:t>
       </w:r>
     </w:p>
   </w:comment>
@@ -4359,7 +4649,7 @@
       </w:r>
     </w:p>
   </w:comment>
-  <w:comment w:author="Hannah Xia" w:id="12" w:date="2024-11-11T03:52:20Z">
+  <w:comment w:author="Hannah Xia" w:id="18" w:date="2024-11-11T03:52:20Z">
     <w:p>
       <w:pPr>
         <w:keepNext w:val="0"/>
@@ -4410,7 +4700,7 @@
       </w:r>
     </w:p>
   </w:comment>
-  <w:comment w:author="Hannah Xia" w:id="13" w:date="2024-11-13T20:21:51Z">
+  <w:comment w:author="Samuel Ergando" w:id="19" w:date="2024-11-14T01:46:32Z">
     <w:p>
       <w:pPr>
         <w:keepNext w:val="0"/>
@@ -4457,11 +4747,11 @@
           <w:vertAlign w:val="baseline"/>
           <w:rtl w:val="0"/>
         </w:rPr>
-        <w:t xml:space="preserve">This is a bit of a risk. Using so many loops will make debugging and coding difficult. Be mindful of how much time you have to code.</w:t>
+        <w:t xml:space="preserve">Dealing with your servers at such a low level seems overkill, I don't know if it is for certain because Im not adequetly informed on this. However Im sure there are libraries that abstract this way.</w:t>
       </w:r>
     </w:p>
   </w:comment>
-  <w:comment w:author="Samuel Ergando" w:id="3" w:date="2024-11-14T01:14:38Z">
+  <w:comment w:author="Hannah Xia" w:id="20" w:date="2024-11-13T20:21:51Z">
     <w:p>
       <w:pPr>
         <w:keepNext w:val="0"/>
@@ -4508,9 +4798,11 @@
           <w:vertAlign w:val="baseline"/>
           <w:rtl w:val="0"/>
         </w:rPr>
-        <w:t xml:space="preserve">Feature Proposal: </w:t>
-      </w:r>
-    </w:p>
+        <w:t xml:space="preserve">This is a bit of a risk. Using so many loops will make debugging and coding difficult. Be mindful of how much time you have to code.</w:t>
+      </w:r>
+    </w:p>
+  </w:comment>
+  <w:comment w:author="Samuel Ergando" w:id="4" w:date="2024-11-14T01:14:38Z">
     <w:p>
       <w:pPr>
         <w:keepNext w:val="0"/>
@@ -4557,11 +4849,9 @@
           <w:vertAlign w:val="baseline"/>
           <w:rtl w:val="0"/>
         </w:rPr>
-        <w:t xml:space="preserve">Have 3 different teams  here is probably the reason why the group went a bit overkill on Networking. It would have been more productive to merge the responsibilities of the 2 other teams into the Networking team such that Backend does game logic, and Frontend GUI. This is way the Networking team doesn't have to go so unneccesarily in depth on a synchronization plan. But I will say that I now understand why they have done so much here, definitely above and beyond but a little to ambitious for SENG final project.</w:t>
-      </w:r>
-    </w:p>
-  </w:comment>
-  <w:comment w:author="Hannah Xia" w:id="5" w:date="2024-11-11T03:59:18Z">
+        <w:t xml:space="preserve">Feature Proposal: </w:t>
+      </w:r>
+    </w:p>
     <w:p>
       <w:pPr>
         <w:keepNext w:val="0"/>
@@ -4608,9 +4898,11 @@
           <w:vertAlign w:val="baseline"/>
           <w:rtl w:val="0"/>
         </w:rPr>
-        <w:t xml:space="preserve">Leaderboard should have these functions but consider only having to retrieve (send/update) after a match has concluded instead of regularly sending over the stored leaderboard data. Or am I not understanding this correctly?</w:t>
-      </w:r>
-    </w:p>
+        <w:t xml:space="preserve">Have 3 different teams  here is probably the reason why the group went a bit overkill on Networking. It would have been more productive to merge the responsibilities of the 2 other teams into the Networking team such that Backend does game logic, and Frontend GUI. This is way the Networking team doesn't have to go so unneccesarily in depth on a synchronization plan. But I will say that I now understand why they have done so much here, definitely above and beyond but a little to ambitious for SENG final project.</w:t>
+      </w:r>
+    </w:p>
+  </w:comment>
+  <w:comment w:author="Samuel Ergando" w:id="8" w:date="2024-11-14T01:31:24Z">
     <w:p>
       <w:pPr>
         <w:keepNext w:val="0"/>
@@ -4644,10 +4936,24 @@
       </w:pPr>
       <w:r>
         <w:rPr>
-          <w:rtl w:val="0"/>
-        </w:rPr>
-      </w:r>
-    </w:p>
+          <w:rFonts w:ascii="Arial" w:cs="Arial" w:eastAsia="Arial" w:hAnsi="Arial"/>
+          <w:b w:val="0"/>
+          <w:i w:val="0"/>
+          <w:smallCaps w:val="0"/>
+          <w:strike w:val="0"/>
+          <w:color w:val="000000"/>
+          <w:sz w:val="22"/>
+          <w:szCs w:val="22"/>
+          <w:u w:val="none"/>
+          <w:shd w:fill="auto" w:val="clear"/>
+          <w:vertAlign w:val="baseline"/>
+          <w:rtl w:val="0"/>
+        </w:rPr>
+        <w:t xml:space="preserve">I was going to suggest using a observer design pattern here but to be honest I think if this was a real world situation the plan to send game state over the network after every turn is pretty solid.</w:t>
+      </w:r>
+    </w:p>
+  </w:comment>
+  <w:comment w:author="Hannah Xia" w:id="6" w:date="2024-11-11T03:59:18Z">
     <w:p>
       <w:pPr>
         <w:keepNext w:val="0"/>
@@ -4694,11 +5000,9 @@
           <w:vertAlign w:val="baseline"/>
           <w:rtl w:val="0"/>
         </w:rPr>
-        <w:t xml:space="preserve">Decoding is a bit excessive, why send things in byte form when it can be stored in a map?</w:t>
-      </w:r>
-    </w:p>
-  </w:comment>
-  <w:comment w:author="Samuel Ergando" w:id="10" w:date="2024-11-14T00:51:51Z">
+        <w:t xml:space="preserve">Leaderboard should have these functions but consider only having to retrieve (send/update) after a match has concluded instead of regularly sending over the stored leaderboard data. Or am I not understanding this correctly?</w:t>
+      </w:r>
+    </w:p>
     <w:p>
       <w:pPr>
         <w:keepNext w:val="0"/>
@@ -4732,24 +5036,10 @@
       </w:pPr>
       <w:r>
         <w:rPr>
-          <w:rFonts w:ascii="Arial" w:cs="Arial" w:eastAsia="Arial" w:hAnsi="Arial"/>
-          <w:b w:val="0"/>
-          <w:i w:val="0"/>
-          <w:smallCaps w:val="0"/>
-          <w:strike w:val="0"/>
-          <w:color w:val="000000"/>
-          <w:sz w:val="22"/>
-          <w:szCs w:val="22"/>
-          <w:u w:val="none"/>
-          <w:shd w:fill="auto" w:val="clear"/>
-          <w:vertAlign w:val="baseline"/>
-          <w:rtl w:val="0"/>
-        </w:rPr>
-        <w:t xml:space="preserve">So given the requirements of this project it probably would have been wise to lead with this. I will say that the effort to suggest your own networking protocol is commendable but it's simply to much work. Designing your own protocol is really a project in itself so it's usually wise even in industry to research a network library that works best for your project specifications.</w:t>
-      </w:r>
-    </w:p>
-  </w:comment>
-  <w:comment w:author="Samuel Ergando" w:id="11" w:date="2024-11-14T00:56:55Z">
+          <w:rtl w:val="0"/>
+        </w:rPr>
+      </w:r>
+    </w:p>
     <w:p>
       <w:pPr>
         <w:keepNext w:val="0"/>
@@ -4796,11 +5086,113 @@
           <w:vertAlign w:val="baseline"/>
           <w:rtl w:val="0"/>
         </w:rPr>
+        <w:t xml:space="preserve">Decoding is a bit excessive, why send things in byte form when it can be stored in a map?</w:t>
+      </w:r>
+    </w:p>
+  </w:comment>
+  <w:comment w:author="Samuel Ergando" w:id="16" w:date="2024-11-14T00:51:51Z">
+    <w:p>
+      <w:pPr>
+        <w:keepNext w:val="0"/>
+        <w:keepLines w:val="0"/>
+        <w:pageBreakBefore w:val="0"/>
+        <w:widowControl w:val="0"/>
+        <w:pBdr>
+          <w:top w:space="0" w:sz="0" w:val="nil"/>
+          <w:left w:space="0" w:sz="0" w:val="nil"/>
+          <w:bottom w:space="0" w:sz="0" w:val="nil"/>
+          <w:right w:space="0" w:sz="0" w:val="nil"/>
+          <w:between w:space="0" w:sz="0" w:val="nil"/>
+        </w:pBdr>
+        <w:shd w:fill="auto" w:val="clear"/>
+        <w:spacing w:after="0" w:before="0" w:line="240" w:lineRule="auto"/>
+        <w:ind w:left="0" w:right="0" w:firstLine="0"/>
+        <w:jc w:val="left"/>
+        <w:rPr>
+          <w:rFonts w:ascii="Arial" w:cs="Arial" w:eastAsia="Arial" w:hAnsi="Arial"/>
+          <w:b w:val="0"/>
+          <w:i w:val="0"/>
+          <w:smallCaps w:val="0"/>
+          <w:strike w:val="0"/>
+          <w:color w:val="000000"/>
+          <w:sz w:val="22"/>
+          <w:szCs w:val="22"/>
+          <w:u w:val="none"/>
+          <w:shd w:fill="auto" w:val="clear"/>
+          <w:vertAlign w:val="baseline"/>
+        </w:rPr>
+      </w:pPr>
+      <w:r>
+        <w:rPr>
+          <w:rFonts w:ascii="Arial" w:cs="Arial" w:eastAsia="Arial" w:hAnsi="Arial"/>
+          <w:b w:val="0"/>
+          <w:i w:val="0"/>
+          <w:smallCaps w:val="0"/>
+          <w:strike w:val="0"/>
+          <w:color w:val="000000"/>
+          <w:sz w:val="22"/>
+          <w:szCs w:val="22"/>
+          <w:u w:val="none"/>
+          <w:shd w:fill="auto" w:val="clear"/>
+          <w:vertAlign w:val="baseline"/>
+          <w:rtl w:val="0"/>
+        </w:rPr>
+        <w:t xml:space="preserve">So given the requirements of this project it probably would have been wise to lead with this. I will say that the effort to suggest your own networking protocol is commendable but it's simply to much work. Designing your own protocol is really a project in itself so it's usually wise even in industry to research a network library that works best for your project specifications.</w:t>
+      </w:r>
+    </w:p>
+  </w:comment>
+  <w:comment w:author="Samuel Ergando" w:id="17" w:date="2024-11-14T00:56:55Z">
+    <w:p>
+      <w:pPr>
+        <w:keepNext w:val="0"/>
+        <w:keepLines w:val="0"/>
+        <w:pageBreakBefore w:val="0"/>
+        <w:widowControl w:val="0"/>
+        <w:pBdr>
+          <w:top w:space="0" w:sz="0" w:val="nil"/>
+          <w:left w:space="0" w:sz="0" w:val="nil"/>
+          <w:bottom w:space="0" w:sz="0" w:val="nil"/>
+          <w:right w:space="0" w:sz="0" w:val="nil"/>
+          <w:between w:space="0" w:sz="0" w:val="nil"/>
+        </w:pBdr>
+        <w:shd w:fill="auto" w:val="clear"/>
+        <w:spacing w:after="0" w:before="0" w:line="240" w:lineRule="auto"/>
+        <w:ind w:left="0" w:right="0" w:firstLine="0"/>
+        <w:jc w:val="left"/>
+        <w:rPr>
+          <w:rFonts w:ascii="Arial" w:cs="Arial" w:eastAsia="Arial" w:hAnsi="Arial"/>
+          <w:b w:val="0"/>
+          <w:i w:val="0"/>
+          <w:smallCaps w:val="0"/>
+          <w:strike w:val="0"/>
+          <w:color w:val="000000"/>
+          <w:sz w:val="22"/>
+          <w:szCs w:val="22"/>
+          <w:u w:val="none"/>
+          <w:shd w:fill="auto" w:val="clear"/>
+          <w:vertAlign w:val="baseline"/>
+        </w:rPr>
+      </w:pPr>
+      <w:r>
+        <w:rPr>
+          <w:rFonts w:ascii="Arial" w:cs="Arial" w:eastAsia="Arial" w:hAnsi="Arial"/>
+          <w:b w:val="0"/>
+          <w:i w:val="0"/>
+          <w:smallCaps w:val="0"/>
+          <w:strike w:val="0"/>
+          <w:color w:val="000000"/>
+          <w:sz w:val="22"/>
+          <w:szCs w:val="22"/>
+          <w:u w:val="none"/>
+          <w:shd w:fill="auto" w:val="clear"/>
+          <w:vertAlign w:val="baseline"/>
+          <w:rtl w:val="0"/>
+        </w:rPr>
         <w:t xml:space="preserve">So for example if you want to implement TCP/UDP in java for your networking protocol then you could use performant libraries like Extasys.</w:t>
       </w:r>
     </w:p>
   </w:comment>
-  <w:comment w:author="Hannah Xia" w:id="6" w:date="2024-11-13T20:12:06Z">
+  <w:comment w:author="Hannah Xia" w:id="7" w:date="2024-11-13T20:12:06Z">
     <w:p>
       <w:pPr>
         <w:keepNext w:val="0"/>

</xml_diff>